<commit_message>
Replace English fig1 continuum with hand-designed infographic
New figures/fig1_continuum_v2.jpg (193 KB after q=90 compression from
1.1 MB source PNG, also kept) replaces the matplotlib node graph for the
English manuscript's six-stage spectrum overview. All 14 roots laid out
with Arabic + Latin transliteration + frequency badges across a single
continuous color-graded ribbon; bidirectional-causation reading preserved
in the caption verbatim.

Source PNG retained in repo at figures/fig1_continuum_v2.png for archival.
Manuscript markdown, docx, full .tex, and body-only .tex regenerated.
EN paper now uses a distinct figure 1 from the Persian paper (the matplotlib
node-graph continues to serve figures_fa/fig1_continuum.{pdf,png}).

Co-Authored-By: Claude Opus 4.7 (1M context) <noreply@anthropic.com>
</commit_message>
<xml_diff>
--- a/paper/english/manuscript.docx
+++ b/paper/english/manuscript.docx
@@ -3062,14 +3062,14 @@
       <w:r>
         <w:drawing>
           <wp:inline>
-            <wp:extent cx="5334000" cy="2102223"/>
+            <wp:extent cx="5334000" cy="2222042"/>
             <wp:effectExtent b="0" l="0" r="0" t="0"/>
             <wp:docPr descr="The six-stage Qur’anic anger-spectrum continuum along the action-intensity axis. Node area scales with QAC attestation frequency. Stages: S1 pre-anger displeasure (ʾff–krh); S2 inner pressure (ḍyq–ḥzn–ʾsf); S3 evaluative aversion (nqm–sxṭ–mqt); S4 active anger (ġḍb–ḥrd); S5 compressed/explosive rage (ġyẓ; tamayyuz as manifestation); S6 behavioural outcomes (bġy–ṭġy–ʿtw) — causation bidirectional rather than purely downstream (§4.8.5). Mass at S6 (n=145) ≈ S1–5 (n=167); the χ²(1) = 1.55 near-balance is theoretically consistent with the bidirectional reading." title="" id="61" name="Picture"/>
             <a:graphic>
               <a:graphicData uri="http://schemas.openxmlformats.org/drawingml/2006/picture">
                 <pic:pic>
                   <pic:nvPicPr>
-                    <pic:cNvPr descr="fig1_continuum.png" id="62" name="Picture"/>
+                    <pic:cNvPr descr="fig1_continuum_v2.jpg" id="62" name="Picture"/>
                     <pic:cNvPicPr>
                       <a:picLocks noChangeArrowheads="1" noChangeAspect="1"/>
                     </pic:cNvPicPr>
@@ -3083,7 +3083,7 @@
                   <pic:spPr bwMode="auto">
                     <a:xfrm>
                       <a:off x="0" y="0"/>
-                      <a:ext cx="5334000" cy="2102223"/>
+                      <a:ext cx="5334000" cy="2222042"/>
                     </a:xfrm>
                     <a:prstGeom prst="rect">
                       <a:avLst/>

</xml_diff>

<commit_message>
Replace English fig6 metaphor with hand-designed vessel triad
New figures/fig6_metaphor_v2.jpg (276 KB compressed from 1.6 MB source PNG,
both retained) replaces the matplotlib three-panel container-metaphor
diagram for the English manuscript. Three terracotta amphorae: open
(ghadab) - sealed with leather knot (ghayz + kazm, Q. 3:134) -
structurally split with internal crimson fissure (tamayyuz, Surat al-Mulk
8). The third panel correctly depicts container failure rather than
content escape, which is the paper's central comparative claim against
the English "explode/burst" metaphor.

Manuscript markdown, docx, full .tex, body .tex regenerated. EN paper
fig6 now distinct from FA paper fig6 (matplotlib version retained in
figures_fa/).

Co-Authored-By: Claude Opus 4.7 (1M context) <noreply@anthropic.com>
</commit_message>
<xml_diff>
--- a/paper/english/manuscript.docx
+++ b/paper/english/manuscript.docx
@@ -19854,14 +19854,14 @@
       <w:r>
         <w:drawing>
           <wp:inline>
-            <wp:extent cx="5334000" cy="2698376"/>
+            <wp:extent cx="5334000" cy="2445230"/>
             <wp:effectExtent b="0" l="0" r="0" t="0"/>
             <wp:docPr descr="The ANGER-IS-A-PRESSURIZED-CONTAINER schema (after Lakoff and Kövecses, ‘Cognitive Model of Anger’), instantiated by ghaḍab → ghayẓ + kaẓm → tamayyuz. Panel 1 (S4): ghaḍab — open container, affect dissipating into language. Panel 2 (S5, Q. 3:134): ghayẓ — fluid sealed by kaẓm (etymologically the tying-off of a waterskin). Panel 3 (S5 manifestation, Q. 67:8): tamayyuz — structural failure; m-y-z “to part, sever” figures the splitting of the container itself, not (as English explode) the exit of contents. The Qur’anic instantiation is, on the conservative claim of §5.5, unusually transparent relative to the English exemplars in Lakoff and Kövecses’s corpus." title="" id="145" name="Picture"/>
             <a:graphic>
               <a:graphicData uri="http://schemas.openxmlformats.org/drawingml/2006/picture">
                 <pic:pic>
                   <pic:nvPicPr>
-                    <pic:cNvPr descr="fig6_metaphor_diagram.png" id="146" name="Picture"/>
+                    <pic:cNvPr descr="fig6_metaphor_v2.jpg" id="146" name="Picture"/>
                     <pic:cNvPicPr>
                       <a:picLocks noChangeArrowheads="1" noChangeAspect="1"/>
                     </pic:cNvPicPr>
@@ -19875,7 +19875,7 @@
                   <pic:spPr bwMode="auto">
                     <a:xfrm>
                       <a:off x="0" y="0"/>
-                      <a:ext cx="5334000" cy="2698376"/>
+                      <a:ext cx="5334000" cy="2445230"/>
                     </a:xfrm>
                     <a:prstGeom prst="rect">
                       <a:avLst/>

</xml_diff>

<commit_message>
Add fig8 methodology pipeline diagram to English manuscript §3.3
New figures/fig8_methodology.jpg (304 KB compressed from 1.5 MB PNG, both
retained) visualises the five-tier reproducible pipeline: sources →
parse → root selection → analyses → outputs. Inserted at the end of §3.3
after the Reproducibility audit paragraph, so the prose description and
the diagram appear together.

This figure has no Persian-paper equivalent — it is uniquely a JQS-style
showcase of the computational-methodology signature for the English
submission. The Persian paper will get its own distinct new figures
(nine-mufassir convergence map, bidirectional-causation diagram, Iranian
cognitive-semantics genealogy) in the next round.

Manuscript markdown, docx, full .tex, body .tex regenerated.

Co-Authored-By: Claude Opus 4.7 (1M context) <noreply@anthropic.com>
</commit_message>
<xml_diff>
--- a/paper/english/manuscript.docx
+++ b/paper/english/manuscript.docx
@@ -2,7 +2,7 @@
 <file path=word/document.xml><?xml version="1.0" encoding="utf-8"?>
 <w:document xmlns:w="http://schemas.openxmlformats.org/wordprocessingml/2006/main" xmlns:m="http://schemas.openxmlformats.org/officeDocument/2006/math" xmlns:r="http://schemas.openxmlformats.org/officeDocument/2006/relationships" xmlns:o="urn:schemas-microsoft-com:office:office" xmlns:v="urn:schemas-microsoft-com:vml" xmlns:w10="urn:schemas-microsoft-com:office:word" xmlns:a="http://schemas.openxmlformats.org/drawingml/2006/main" xmlns:pic="http://schemas.openxmlformats.org/drawingml/2006/picture" xmlns:wp="http://schemas.openxmlformats.org/drawingml/2006/wordprocessingDrawing">
   <w:body>
-    <w:bookmarkStart w:id="175" w:name="Xd9de8ad42f66a36b2c57b2c6630752880b6369e"/>
+    <w:bookmarkStart w:id="178" w:name="Xd9de8ad42f66a36b2c57b2c6630752880b6369e"/>
     <w:p>
       <w:pPr>
         <w:pStyle w:val="Heading1"/>
@@ -3220,7 +3220,7 @@
     </w:p>
     <w:bookmarkEnd w:id="63"/>
     <w:bookmarkEnd w:id="64"/>
-    <w:bookmarkStart w:id="81" w:name="methods"/>
+    <w:bookmarkStart w:id="84" w:name="methods"/>
     <w:p>
       <w:pPr>
         <w:pStyle w:val="Heading2"/>
@@ -3706,7 +3706,7 @@
       </w:r>
     </w:p>
     <w:bookmarkEnd w:id="68"/>
-    <w:bookmarkStart w:id="70" w:name="computational-pipeline"/>
+    <w:bookmarkStart w:id="73" w:name="computational-pipeline"/>
     <w:p>
       <w:pPr>
         <w:pStyle w:val="Heading3"/>
@@ -3887,8 +3887,92 @@
         <w:t xml:space="preserve">.</w:t>
       </w:r>
     </w:p>
-    <w:bookmarkEnd w:id="70"/>
-    <w:bookmarkStart w:id="73" w:name="quantitative-analyses"/>
+    <w:p>
+      <w:pPr>
+        <w:pStyle w:val="CaptionedFigure"/>
+      </w:pPr>
+      <w:r>
+        <w:drawing>
+          <wp:inline>
+            <wp:extent cx="5067300" cy="7600950"/>
+            <wp:effectExtent b="0" l="0" r="0" t="0"/>
+            <wp:docPr descr="End-to-end pipeline from corpus to findings. Sources tier: QAC v0.4 (Dukes 2011, GPL), Tanzil Project Uthmani text (CC-BY-ND 3.0), and the nine classical tafāsīr whose qualitative readings ground §§4–5. Parse tier: Buckwalter → Unicode collapse, segment-to-word aggregation. Selection tier: the fourteen spectrum roots and the five umbrella-moral roots used for the robustness checks of §4.9. Analyses tier: distributional statistics (χ² with marginal-preserving permutation null, Holm-Bonferroni-adjusted binomials, Cochran–Armitage trend), network analysis (aya-level co-occurrence, weighted degree/betweenness/closeness with bootstrap 95% CIs), tafsīr-grounded coding (145 Stage-6 attestations, κ = 0.79), and the illustrative comparative-translation audit. Outputs tier: 312 attestations across six stages (S1 = 44, S2 = 60, S3 = 27, S4 = 25, S5 = 11, S6 = 145), seven figures and the supporting CSV tables, and the Stage-6 causation breakdown (26% anger-derived / 49% structurally derived / 25% mixed). Pipeline is deterministic — identical inputs produce byte-identical CSVs and figures from a fresh repository clone." title="" id="71" name="Picture"/>
+            <a:graphic>
+              <a:graphicData uri="http://schemas.openxmlformats.org/drawingml/2006/picture">
+                <pic:pic>
+                  <pic:nvPicPr>
+                    <pic:cNvPr descr="fig8_methodology.jpg" id="72" name="Picture"/>
+                    <pic:cNvPicPr>
+                      <a:picLocks noChangeArrowheads="1" noChangeAspect="1"/>
+                    </pic:cNvPicPr>
+                  </pic:nvPicPr>
+                  <pic:blipFill>
+                    <a:blip r:embed="rId70"/>
+                    <a:stretch>
+                      <a:fillRect/>
+                    </a:stretch>
+                  </pic:blipFill>
+                  <pic:spPr bwMode="auto">
+                    <a:xfrm>
+                      <a:off x="0" y="0"/>
+                      <a:ext cx="5067300" cy="7600950"/>
+                    </a:xfrm>
+                    <a:prstGeom prst="rect">
+                      <a:avLst/>
+                    </a:prstGeom>
+                    <a:noFill/>
+                    <a:ln w="9525">
+                      <a:noFill/>
+                      <a:headEnd/>
+                      <a:tailEnd/>
+                    </a:ln>
+                  </pic:spPr>
+                </pic:pic>
+              </a:graphicData>
+            </a:graphic>
+          </wp:inline>
+        </w:drawing>
+      </w:r>
+    </w:p>
+    <w:p>
+      <w:pPr>
+        <w:pStyle w:val="ImageCaption"/>
+      </w:pPr>
+      <w:r>
+        <w:t xml:space="preserve">End-to-end pipeline from corpus to findings. Sources tier: QAC v0.4 (Dukes 2011, GPL), Tanzil Project Uthmani text (CC-BY-ND 3.0), and the nine classical</w:t>
+      </w:r>
+      <w:r>
+        <w:t xml:space="preserve"> </w:t>
+      </w:r>
+      <w:r>
+        <w:rPr>
+          <w:i/>
+          <w:iCs/>
+        </w:rPr>
+        <w:t xml:space="preserve">tafāsīr</w:t>
+      </w:r>
+      <w:r>
+        <w:t xml:space="preserve"> </w:t>
+      </w:r>
+      <w:r>
+        <w:t xml:space="preserve">whose qualitative readings ground §§4–5. Parse tier: Buckwalter → Unicode collapse, segment-to-word aggregation. Selection tier: the fourteen spectrum roots and the five umbrella-moral roots used for the robustness checks of §4.9. Analyses tier: distributional statistics (χ² with marginal-preserving permutation null, Holm-Bonferroni-adjusted binomials, Cochran–Armitage trend), network analysis (aya-level co-occurrence, weighted degree/betweenness/closeness with bootstrap 95% CIs),</w:t>
+      </w:r>
+      <w:r>
+        <w:t xml:space="preserve"> </w:t>
+      </w:r>
+      <w:r>
+        <w:rPr>
+          <w:i/>
+          <w:iCs/>
+        </w:rPr>
+        <w:t xml:space="preserve">tafsīr</w:t>
+      </w:r>
+      <w:r>
+        <w:t xml:space="preserve">-grounded coding (145 Stage-6 attestations, κ = 0.79), and the illustrative comparative-translation audit. Outputs tier: 312 attestations across six stages (S1 = 44, S2 = 60, S3 = 27, S4 = 25, S5 = 11, S6 = 145), seven figures and the supporting CSV tables, and the Stage-6 causation breakdown (26% anger-derived / 49% structurally derived / 25% mixed). Pipeline is deterministic — identical inputs produce byte-identical CSVs and figures from a fresh repository clone.</w:t>
+      </w:r>
+    </w:p>
+    <w:bookmarkEnd w:id="73"/>
+    <w:bookmarkStart w:id="76" w:name="quantitative-analyses"/>
     <w:p>
       <w:pPr>
         <w:pStyle w:val="Heading3"/>
@@ -3937,7 +4021,7 @@
         <w:rPr>
           <w:rStyle w:val="FootnoteReference"/>
         </w:rPr>
-        <w:footnoteReference w:id="71"/>
+        <w:footnoteReference w:id="74"/>
       </w:r>
       <w:r>
         <w:t xml:space="preserve"> </w:t>
@@ -3949,7 +4033,7 @@
         <w:rPr>
           <w:rStyle w:val="FootnoteReference"/>
         </w:rPr>
-        <w:footnoteReference w:id="72"/>
+        <w:footnoteReference w:id="75"/>
       </w:r>
       <w:r>
         <w:t xml:space="preserve"> </w:t>
@@ -3958,8 +4042,8 @@
         <w:t xml:space="preserve">operates at the discourse-topic level on coarse sentiment and does not yet apply this battery at the lexeme level.</w:t>
       </w:r>
     </w:p>
-    <w:bookmarkEnd w:id="73"/>
-    <w:bookmarkStart w:id="74" w:name="qualitative-analyses"/>
+    <w:bookmarkEnd w:id="76"/>
+    <w:bookmarkStart w:id="77" w:name="qualitative-analyses"/>
     <w:p>
       <w:pPr>
         <w:pStyle w:val="Heading3"/>
@@ -4196,8 +4280,8 @@
         <w:t xml:space="preserve">); (d) illustrative translation-criticism on five English translations (Yusuf Ali, Pickthall, Arberry, Saheeh International, Hilali-Khan) at canonical exemplar verses (§4.10) — framed throughout as illustrative rather than systematic.</w:t>
       </w:r>
     </w:p>
-    <w:bookmarkEnd w:id="74"/>
-    <w:bookmarkStart w:id="80" w:name="validity-check"/>
+    <w:bookmarkEnd w:id="77"/>
+    <w:bookmarkStart w:id="83" w:name="validity-check"/>
     <w:p>
       <w:pPr>
         <w:pStyle w:val="Heading3"/>
@@ -4468,7 +4552,7 @@
         <w:rPr>
           <w:rStyle w:val="FootnoteReference"/>
         </w:rPr>
-        <w:footnoteReference w:id="75"/>
+        <w:footnoteReference w:id="78"/>
       </w:r>
       <w:r>
         <w:t xml:space="preserve"> </w:t>
@@ -4480,7 +4564,7 @@
         <w:rPr>
           <w:rStyle w:val="FootnoteReference"/>
         </w:rPr>
-        <w:footnoteReference w:id="76"/>
+        <w:footnoteReference w:id="79"/>
       </w:r>
       <w:r>
         <w:t xml:space="preserve"> </w:t>
@@ -4492,7 +4576,7 @@
         <w:rPr>
           <w:rStyle w:val="FootnoteReference"/>
         </w:rPr>
-        <w:footnoteReference w:id="77"/>
+        <w:footnoteReference w:id="80"/>
       </w:r>
       <w:r>
         <w:t xml:space="preserve"> </w:t>
@@ -4504,7 +4588,7 @@
         <w:rPr>
           <w:rStyle w:val="FootnoteReference"/>
         </w:rPr>
-        <w:footnoteReference w:id="78"/>
+        <w:footnoteReference w:id="81"/>
       </w:r>
       <w:r>
         <w:t xml:space="preserve"> </w:t>
@@ -4548,7 +4632,7 @@
         <w:rPr>
           <w:rStyle w:val="FootnoteReference"/>
         </w:rPr>
-        <w:footnoteReference w:id="79"/>
+        <w:footnoteReference w:id="82"/>
       </w:r>
       <w:r>
         <w:t xml:space="preserve"> </w:t>
@@ -4577,9 +4661,9 @@
         </w:pict>
       </w:r>
     </w:p>
-    <w:bookmarkEnd w:id="80"/>
-    <w:bookmarkEnd w:id="81"/>
-    <w:bookmarkStart w:id="117" w:name="findings"/>
+    <w:bookmarkEnd w:id="83"/>
+    <w:bookmarkEnd w:id="84"/>
+    <w:bookmarkStart w:id="120" w:name="findings"/>
     <w:p>
       <w:pPr>
         <w:pStyle w:val="Heading2"/>
@@ -4588,7 +4672,7 @@
         <w:t xml:space="preserve">4. Findings</w:t>
       </w:r>
     </w:p>
-    <w:bookmarkStart w:id="82" w:name="the-four-lexicon-etymology-table"/>
+    <w:bookmarkStart w:id="85" w:name="the-four-lexicon-etymology-table"/>
     <w:p>
       <w:pPr>
         <w:pStyle w:val="Heading3"/>
@@ -6326,8 +6410,8 @@
         <w:t xml:space="preserve">.</w:t>
       </w:r>
     </w:p>
-    <w:bookmarkEnd w:id="82"/>
-    <w:bookmarkStart w:id="94" w:name="distributional-summary"/>
+    <w:bookmarkEnd w:id="85"/>
+    <w:bookmarkStart w:id="97" w:name="distributional-summary"/>
     <w:p>
       <w:pPr>
         <w:pStyle w:val="Heading3"/>
@@ -7840,7 +7924,7 @@
         <w:rPr>
           <w:rStyle w:val="FootnoteReference"/>
         </w:rPr>
-        <w:footnoteReference w:id="83"/>
+        <w:footnoteReference w:id="86"/>
       </w:r>
       <w:r>
         <w:t xml:space="preserve"> </w:t>
@@ -8068,7 +8152,7 @@
         <w:t xml:space="preserve">causal relation to the anger spectrum—anger may produce these behaviours, but the behaviours can equally produce anger (in their victims, the prophets, and the divine response). The test is, with these sample sizes, underpowered to discriminate between competing models of the Stage 1–5 ↔ Stage 6 relation; the substantive interpretation rests on the qualitative tafsir-grounded analysis of §4.8.5, not on the statistical near-balance.</w:t>
       </w:r>
     </w:p>
-    <w:bookmarkStart w:id="93" w:name="Xe206a6e1c8ed6f6373fbf795932a50b3b377def"/>
+    <w:bookmarkStart w:id="96" w:name="Xe206a6e1c8ed6f6373fbf795932a50b3b377def"/>
     <w:p>
       <w:pPr>
         <w:pStyle w:val="Heading4"/>
@@ -8374,18 +8458,18 @@
           <wp:inline>
             <wp:extent cx="5067300" cy="2007591"/>
             <wp:effectExtent b="0" l="0" r="0" t="0"/>
-            <wp:docPr descr="Per-root and per-stage frequency of the 312 core spectrum attestations. Left: per-root frequency, bar colour encoding stage. Stage 6 internal asymmetry (bġy 96 vs ʿtw 10) reflects the lexical division between distributed-aggression and obstinate-defiance (§4.8). Right: stage totals S1=44, S2=60, S3=27, S4=25, S5=11, S6=145. χ²(5) = 227.15 (asymptotic p &lt; 0.001), but permutation null p = 0.24 — see §4.2. Phenomenological core (S1–5 = 167) vs Stage 6 (145): χ²(1) = 1.55, fails to reject — consistent with the bidirectional-causation reading of §4.8.5." title="" id="85" name="Picture"/>
+            <wp:docPr descr="Per-root and per-stage frequency of the 312 core spectrum attestations. Left: per-root frequency, bar colour encoding stage. Stage 6 internal asymmetry (bġy 96 vs ʿtw 10) reflects the lexical division between distributed-aggression and obstinate-defiance (§4.8). Right: stage totals S1=44, S2=60, S3=27, S4=25, S5=11, S6=145. χ²(5) = 227.15 (asymptotic p &lt; 0.001), but permutation null p = 0.24 — see §4.2. Phenomenological core (S1–5 = 167) vs Stage 6 (145): χ²(1) = 1.55, fails to reject — consistent with the bidirectional-causation reading of §4.8.5." title="" id="88" name="Picture"/>
             <a:graphic>
               <a:graphicData uri="http://schemas.openxmlformats.org/drawingml/2006/picture">
                 <pic:pic>
                   <pic:nvPicPr>
-                    <pic:cNvPr descr="fig2_frequency_by_stage.png" id="86" name="Picture"/>
+                    <pic:cNvPr descr="fig2_frequency_by_stage.png" id="89" name="Picture"/>
                     <pic:cNvPicPr>
                       <a:picLocks noChangeArrowheads="1" noChangeAspect="1"/>
                     </pic:cNvPicPr>
                   </pic:nvPicPr>
                   <pic:blipFill>
-                    <a:blip r:embed="rId84"/>
+                    <a:blip r:embed="rId87"/>
                     <a:stretch>
                       <a:fillRect/>
                     </a:stretch>
@@ -8532,18 +8616,18 @@
           <wp:inline>
             <wp:extent cx="5067300" cy="2168053"/>
             <wp:effectExtent b="0" l="0" r="0" t="0"/>
-            <wp:docPr descr="Stacked Meccan/Medinan distribution for the fourteen core roots. Sakhaṭ (S3) exclusively Medinan (0/4; raw p = 0.005, Holm-adj. 0.05) — the only root surviving FDR. Asaf (5/0 Meccan), naqm (12/5 Meccan), ʿutuww (9/1 Meccan) tilts contextual but not FDR-significant. Ḥard hapax (Q. 68:25, Meccan). The patterns instantiate discursive-contextual specialisation (§5.4)." title="" id="88" name="Picture"/>
+            <wp:docPr descr="Stacked Meccan/Medinan distribution for the fourteen core roots. Sakhaṭ (S3) exclusively Medinan (0/4; raw p = 0.005, Holm-adj. 0.05) — the only root surviving FDR. Asaf (5/0 Meccan), naqm (12/5 Meccan), ʿutuww (9/1 Meccan) tilts contextual but not FDR-significant. Ḥard hapax (Q. 68:25, Meccan). The patterns instantiate discursive-contextual specialisation (§5.4)." title="" id="91" name="Picture"/>
             <a:graphic>
               <a:graphicData uri="http://schemas.openxmlformats.org/drawingml/2006/picture">
                 <pic:pic>
                   <pic:nvPicPr>
-                    <pic:cNvPr descr="fig3_meccan_medinan.png" id="89" name="Picture"/>
+                    <pic:cNvPr descr="fig3_meccan_medinan.png" id="92" name="Picture"/>
                     <pic:cNvPicPr>
                       <a:picLocks noChangeArrowheads="1" noChangeAspect="1"/>
                     </pic:cNvPicPr>
                   </pic:nvPicPr>
                   <pic:blipFill>
-                    <a:blip r:embed="rId87"/>
+                    <a:blip r:embed="rId90"/>
                     <a:stretch>
                       <a:fillRect/>
                     </a:stretch>
@@ -8699,18 +8783,18 @@
           <wp:inline>
             <wp:extent cx="5067300" cy="2521797"/>
             <wp:effectExtent b="0" l="0" r="0" t="0"/>
-            <wp:docPr descr="Morphological profile by part of speech. The left-to-right gradient shows verbal dominance at Stages 1–2 (ḥzn 88% verbal, ḍyq 62% — transient situational states), nominalisation at Stage 4 (ghḍb 16n/6v — stable attributable referent), and peak nominality with emerging participial forms at Stage 6 (ṭāghūt, bāghin — entrenched agent-property). The verbal→nominal gradient is independent corpus-internal evidence for the action-intensity continuum: as intensity ascends, representation reifies from event to attribute to identity." title="" id="91" name="Picture"/>
+            <wp:docPr descr="Morphological profile by part of speech. The left-to-right gradient shows verbal dominance at Stages 1–2 (ḥzn 88% verbal, ḍyq 62% — transient situational states), nominalisation at Stage 4 (ghḍb 16n/6v — stable attributable referent), and peak nominality with emerging participial forms at Stage 6 (ṭāghūt, bāghin — entrenched agent-property). The verbal→nominal gradient is independent corpus-internal evidence for the action-intensity continuum: as intensity ascends, representation reifies from event to attribute to identity." title="" id="94" name="Picture"/>
             <a:graphic>
               <a:graphicData uri="http://schemas.openxmlformats.org/drawingml/2006/picture">
                 <pic:pic>
                   <pic:nvPicPr>
-                    <pic:cNvPr descr="fig5_morphology_stack.png" id="92" name="Picture"/>
+                    <pic:cNvPr descr="fig5_morphology_stack.png" id="95" name="Picture"/>
                     <pic:cNvPicPr>
                       <a:picLocks noChangeArrowheads="1" noChangeAspect="1"/>
                     </pic:cNvPicPr>
                   </pic:nvPicPr>
                   <pic:blipFill>
-                    <a:blip r:embed="rId90"/>
+                    <a:blip r:embed="rId93"/>
                     <a:stretch>
                       <a:fillRect/>
                     </a:stretch>
@@ -8858,9 +8942,9 @@
         <w:t xml:space="preserve">.</w:t>
       </w:r>
     </w:p>
-    <w:bookmarkEnd w:id="93"/>
-    <w:bookmarkEnd w:id="94"/>
-    <w:bookmarkStart w:id="95" w:name="stage-1-pre-anger-displeasure"/>
+    <w:bookmarkEnd w:id="96"/>
+    <w:bookmarkEnd w:id="97"/>
+    <w:bookmarkStart w:id="98" w:name="stage-1-pre-anger-displeasure"/>
     <w:p>
       <w:pPr>
         <w:pStyle w:val="Heading3"/>
@@ -9365,8 +9449,8 @@
         <w:t xml:space="preserve">is a structural cognate worth noting because it shares the root and instantiates a Stage-6-like behavioural extension of distaste.</w:t>
       </w:r>
     </w:p>
-    <w:bookmarkEnd w:id="95"/>
-    <w:bookmarkStart w:id="97" w:name="stage-2-inner-pressure-and-contraction"/>
+    <w:bookmarkEnd w:id="98"/>
+    <w:bookmarkStart w:id="100" w:name="stage-2-inner-pressure-and-contraction"/>
     <w:p>
       <w:pPr>
         <w:pStyle w:val="Heading3"/>
@@ -9824,7 +9908,7 @@
         <w:rPr>
           <w:rStyle w:val="FootnoteReference"/>
         </w:rPr>
-        <w:footnoteReference w:id="96"/>
+        <w:footnoteReference w:id="99"/>
       </w:r>
       <w:r>
         <w:t xml:space="preserve"> </w:t>
@@ -10432,8 +10516,8 @@
         <w:t xml:space="preserve">).</w:t>
       </w:r>
     </w:p>
-    <w:bookmarkEnd w:id="97"/>
-    <w:bookmarkStart w:id="99" w:name="stage-3-evaluative-aversion"/>
+    <w:bookmarkEnd w:id="100"/>
+    <w:bookmarkStart w:id="102" w:name="stage-3-evaluative-aversion"/>
     <w:p>
       <w:pPr>
         <w:pStyle w:val="Heading3"/>
@@ -11368,7 +11452,7 @@
         <w:rPr>
           <w:rStyle w:val="FootnoteReference"/>
         </w:rPr>
-        <w:footnoteReference w:id="98"/>
+        <w:footnoteReference w:id="101"/>
       </w:r>
       <w:r>
         <w:t xml:space="preserve"> </w:t>
@@ -11734,8 +11818,8 @@
         <w:t xml:space="preserve">of Stage 4.</w:t>
       </w:r>
     </w:p>
-    <w:bookmarkEnd w:id="99"/>
-    <w:bookmarkStart w:id="100" w:name="stage-4-active-anger"/>
+    <w:bookmarkEnd w:id="102"/>
+    <w:bookmarkStart w:id="103" w:name="stage-4-active-anger"/>
     <w:p>
       <w:pPr>
         <w:pStyle w:val="Heading3"/>
@@ -12140,8 +12224,8 @@
         <w:t xml:space="preserve">-driven plan to deny. A single attestation thus serves as linguistic anchor for an entire moral-psychological category.</w:t>
       </w:r>
     </w:p>
-    <w:bookmarkEnd w:id="100"/>
-    <w:bookmarkStart w:id="103" w:name="stage-5-compressedexplosive-rage"/>
+    <w:bookmarkEnd w:id="103"/>
+    <w:bookmarkStart w:id="106" w:name="stage-5-compressedexplosive-rage"/>
     <w:p>
       <w:pPr>
         <w:pStyle w:val="Heading3"/>
@@ -12312,7 +12396,7 @@
         <w:rPr>
           <w:rStyle w:val="FootnoteReference"/>
         </w:rPr>
-        <w:footnoteReference w:id="101"/>
+        <w:footnoteReference w:id="104"/>
       </w:r>
       <w:r>
         <w:t xml:space="preserve"> </w:t>
@@ -12564,7 +12648,7 @@
         <w:rPr>
           <w:rStyle w:val="FootnoteReference"/>
         </w:rPr>
-        <w:footnoteReference w:id="102"/>
+        <w:footnoteReference w:id="105"/>
       </w:r>
       <w:r>
         <w:t xml:space="preserve"> </w:t>
@@ -12573,8 +12657,8 @@
         <w:t xml:space="preserve">whether this is the strongest historical instance is left open pending the cross-cultural philological survey we commend in §5.5.</w:t>
       </w:r>
     </w:p>
-    <w:bookmarkEnd w:id="103"/>
-    <w:bookmarkStart w:id="114" w:name="Xa109e1ffa5f4656b2c8f15f15567f8a540841d1"/>
+    <w:bookmarkEnd w:id="106"/>
+    <w:bookmarkStart w:id="117" w:name="Xa109e1ffa5f4656b2c8f15f15567f8a540841d1"/>
     <w:p>
       <w:pPr>
         <w:pStyle w:val="Heading3"/>
@@ -14131,7 +14215,7 @@
         <w:rPr>
           <w:rStyle w:val="FootnoteReference"/>
         </w:rPr>
-        <w:footnoteReference w:id="104"/>
+        <w:footnoteReference w:id="107"/>
       </w:r>
       <w:r>
         <w:t xml:space="preserve"> </w:t>
@@ -14143,7 +14227,7 @@
         <w:rPr>
           <w:rStyle w:val="FootnoteReference"/>
         </w:rPr>
-        <w:footnoteReference w:id="105"/>
+        <w:footnoteReference w:id="108"/>
       </w:r>
       <w:r>
         <w:t xml:space="preserve"> </w:t>
@@ -14155,7 +14239,7 @@
         <w:rPr>
           <w:rStyle w:val="FootnoteReference"/>
         </w:rPr>
-        <w:footnoteReference w:id="106"/>
+        <w:footnoteReference w:id="109"/>
       </w:r>
       <w:r>
         <w:t xml:space="preserve"> </w:t>
@@ -14173,7 +14257,7 @@
         <w:rPr>
           <w:rStyle w:val="FootnoteReference"/>
         </w:rPr>
-        <w:footnoteReference w:id="107"/>
+        <w:footnoteReference w:id="110"/>
       </w:r>
       <w:r>
         <w:t xml:space="preserve"> </w:t>
@@ -14734,18 +14818,18 @@
           <wp:inline>
             <wp:extent cx="5067300" cy="4314502"/>
             <wp:effectExtent b="0" l="0" r="0" t="0"/>
-            <wp:docPr descr="Aya-level co-occurrence network of the fourteen core roots; edges weighted by shared-ayat count. Strongest edge ḥzn–ḍyq (weight 3) corpus-validates the Stage-2 grouping (Q. 11:12, Q. 6:33). Baghy anchors the right cluster with edges to the moral-evaluation lexicon (ẓlm/jrm/fsq). Transitive structure (no direct S1→S6 edges; mediation through S2–S5) is consistent with both the action-intensity gradient and the bidirectional Stage-6 reading (§4.8.5)." title="" id="109" name="Picture"/>
+            <wp:docPr descr="Aya-level co-occurrence network of the fourteen core roots; edges weighted by shared-ayat count. Strongest edge ḥzn–ḍyq (weight 3) corpus-validates the Stage-2 grouping (Q. 11:12, Q. 6:33). Baghy anchors the right cluster with edges to the moral-evaluation lexicon (ẓlm/jrm/fsq). Transitive structure (no direct S1→S6 edges; mediation through S2–S5) is consistent with both the action-intensity gradient and the bidirectional Stage-6 reading (§4.8.5)." title="" id="112" name="Picture"/>
             <a:graphic>
               <a:graphicData uri="http://schemas.openxmlformats.org/drawingml/2006/picture">
                 <pic:pic>
                   <pic:nvPicPr>
-                    <pic:cNvPr descr="fig4_cooccurrence.png" id="110" name="Picture"/>
+                    <pic:cNvPr descr="fig4_cooccurrence.png" id="113" name="Picture"/>
                     <pic:cNvPicPr>
                       <a:picLocks noChangeArrowheads="1" noChangeAspect="1"/>
                     </pic:cNvPicPr>
                   </pic:nvPicPr>
                   <pic:blipFill>
-                    <a:blip r:embed="rId108"/>
+                    <a:blip r:embed="rId111"/>
                     <a:stretch>
                       <a:fillRect/>
                     </a:stretch>
@@ -14831,18 +14915,18 @@
           <wp:inline>
             <wp:extent cx="5067300" cy="2003525"/>
             <wp:effectExtent b="0" l="0" r="0" t="0"/>
-            <wp:docPr descr="Three centrality measures with bootstrap 95% percentile CIs on the aya-level co-occurrence graph: (a) weighted degree, (b) betweenness, (c) closeness. Baghy: highest closeness point-estimate (0.55, CI [0.23, 0.84]) and shared-highest betweenness (0.15, CI [0.00, 0.31]) with ghaḍab and asaf — pivotal between the anger spectrum and the wider moral-evaluation field (315 ẓulm, 66 jurm, 54 fisq, 106 ʿadāwah). Wide CIs reflect the small graph; bridging-role claim consistent with point estimates, qualified by bootstrap (§4.8.2). Ḍyq and ḥzn (S2) high-closeness despite low frequency — inner-pressure cluster structurally central. Layered reading: S2 affective core, S6 structural bridge, S3–5 mediation." title="" id="112" name="Picture"/>
+            <wp:docPr descr="Three centrality measures with bootstrap 95% percentile CIs on the aya-level co-occurrence graph: (a) weighted degree, (b) betweenness, (c) closeness. Baghy: highest closeness point-estimate (0.55, CI [0.23, 0.84]) and shared-highest betweenness (0.15, CI [0.00, 0.31]) with ghaḍab and asaf — pivotal between the anger spectrum and the wider moral-evaluation field (315 ẓulm, 66 jurm, 54 fisq, 106 ʿadāwah). Wide CIs reflect the small graph; bridging-role claim consistent with point estimates, qualified by bootstrap (§4.8.2). Ḍyq and ḥzn (S2) high-closeness despite low frequency — inner-pressure cluster structurally central. Layered reading: S2 affective core, S6 structural bridge, S3–5 mediation." title="" id="115" name="Picture"/>
             <a:graphic>
               <a:graphicData uri="http://schemas.openxmlformats.org/drawingml/2006/picture">
                 <pic:pic>
                   <pic:nvPicPr>
-                    <pic:cNvPr descr="fig7_centrality.png" id="113" name="Picture"/>
+                    <pic:cNvPr descr="fig7_centrality.png" id="116" name="Picture"/>
                     <pic:cNvPicPr>
                       <a:picLocks noChangeArrowheads="1" noChangeAspect="1"/>
                     </pic:cNvPicPr>
                   </pic:nvPicPr>
                   <pic:blipFill>
-                    <a:blip r:embed="rId111"/>
+                    <a:blip r:embed="rId114"/>
                     <a:stretch>
                       <a:fillRect/>
                     </a:stretch>
@@ -15006,8 +15090,8 @@
         <w:t xml:space="preserve">(S2) high-closeness despite low frequency — inner-pressure cluster structurally central. Layered reading: S2 affective core, S6 structural bridge, S3–5 mediation.</w:t>
       </w:r>
     </w:p>
-    <w:bookmarkEnd w:id="114"/>
-    <w:bookmarkStart w:id="115" w:name="X4791f1e2d81ade18609274a5c9deda1b1b9a973"/>
+    <w:bookmarkEnd w:id="117"/>
+    <w:bookmarkStart w:id="118" w:name="X4791f1e2d81ade18609274a5c9deda1b1b9a973"/>
     <w:p>
       <w:pPr>
         <w:pStyle w:val="Heading3"/>
@@ -15610,8 +15694,8 @@
         <w:t xml:space="preserve">finding is one specific instance.</w:t>
       </w:r>
     </w:p>
-    <w:bookmarkEnd w:id="115"/>
-    <w:bookmarkStart w:id="116" w:name="X26e46b9e8b25d975bd563382bafdf973afc4ad4"/>
+    <w:bookmarkEnd w:id="118"/>
+    <w:bookmarkStart w:id="119" w:name="X26e46b9e8b25d975bd563382bafdf973afc4ad4"/>
     <w:p>
       <w:pPr>
         <w:pStyle w:val="Heading3"/>
@@ -16324,9 +16408,9 @@
         </w:pict>
       </w:r>
     </w:p>
-    <w:bookmarkEnd w:id="116"/>
-    <w:bookmarkEnd w:id="117"/>
-    <w:bookmarkStart w:id="152" w:name="discussion"/>
+    <w:bookmarkEnd w:id="119"/>
+    <w:bookmarkEnd w:id="120"/>
+    <w:bookmarkStart w:id="155" w:name="discussion"/>
     <w:p>
       <w:pPr>
         <w:pStyle w:val="Heading2"/>
@@ -16335,7 +16419,7 @@
         <w:t xml:space="preserve">5. Discussion</w:t>
       </w:r>
     </w:p>
-    <w:bookmarkStart w:id="118" w:name="the-integrated-logic-of-escalation"/>
+    <w:bookmarkStart w:id="121" w:name="the-integrated-logic-of-escalation"/>
     <w:p>
       <w:pPr>
         <w:pStyle w:val="Heading3"/>
@@ -16431,8 +16515,8 @@
         <w:t xml:space="preserve">, structural arrogance), which is why we read the near-balance between Stages 1–5 (167) and Stage 6 (145) as theoretically informative rather than paradoxical.</w:t>
       </w:r>
     </w:p>
-    <w:bookmarkEnd w:id="118"/>
-    <w:bookmarkStart w:id="125" w:name="X72b516463d2c03e5f485bcfe86cd728b07c29e4"/>
+    <w:bookmarkEnd w:id="121"/>
+    <w:bookmarkStart w:id="128" w:name="X72b516463d2c03e5f485bcfe86cd728b07c29e4"/>
     <w:p>
       <w:pPr>
         <w:pStyle w:val="Heading3"/>
@@ -16486,7 +16570,7 @@
         <w:rPr>
           <w:rStyle w:val="FootnoteReference"/>
         </w:rPr>
-        <w:footnoteReference w:id="119"/>
+        <w:footnoteReference w:id="122"/>
       </w:r>
       <w:r>
         <w:t xml:space="preserve"> </w:t>
@@ -17044,7 +17128,7 @@
         <w:rPr>
           <w:rStyle w:val="FootnoteReference"/>
         </w:rPr>
-        <w:footnoteReference w:id="120"/>
+        <w:footnoteReference w:id="123"/>
       </w:r>
       <w:r>
         <w:t xml:space="preserve"> </w:t>
@@ -17241,7 +17325,7 @@
         <w:rPr>
           <w:rStyle w:val="FootnoteReference"/>
         </w:rPr>
-        <w:footnoteReference w:id="121"/>
+        <w:footnoteReference w:id="124"/>
       </w:r>
       <w:r>
         <w:t xml:space="preserve"> </w:t>
@@ -17539,7 +17623,7 @@
         <w:rPr>
           <w:rStyle w:val="FootnoteReference"/>
         </w:rPr>
-        <w:footnoteReference w:id="122"/>
+        <w:footnoteReference w:id="125"/>
       </w:r>
       <w:r>
         <w:t xml:space="preserve"> </w:t>
@@ -17567,7 +17651,7 @@
         <w:rPr>
           <w:rStyle w:val="FootnoteReference"/>
         </w:rPr>
-        <w:footnoteReference w:id="123"/>
+        <w:footnoteReference w:id="126"/>
       </w:r>
       <w:r>
         <w:t xml:space="preserve"> </w:t>
@@ -17670,7 +17754,7 @@
         <w:rPr>
           <w:rStyle w:val="FootnoteReference"/>
         </w:rPr>
-        <w:footnoteReference w:id="124"/>
+        <w:footnoteReference w:id="127"/>
       </w:r>
       <w:r>
         <w:t xml:space="preserve"> </w:t>
@@ -17812,8 +17896,8 @@
         <w:t xml:space="preserve">is, on this reading, a textbook instance of Roseman’s appraisal pattern lexicalised under a single root in the seventh century that twentieth-century cognitive appraisal theory has independently re-derived. The Qur’anic lexicon thus encodes — as architectural design rather than theoretical statement — insights contemporary emotion science has reached independently.</w:t>
       </w:r>
     </w:p>
-    <w:bookmarkEnd w:id="125"/>
-    <w:bookmarkStart w:id="126" w:name="the-phenomenologyoutcomes-balance"/>
+    <w:bookmarkEnd w:id="128"/>
+    <w:bookmarkStart w:id="129" w:name="the-phenomenologyoutcomes-balance"/>
     <w:p>
       <w:pPr>
         <w:pStyle w:val="Heading3"/>
@@ -17905,8 +17989,8 @@
         <w:t xml:space="preserve">, fundamentally entangled with category-membership and category-causation decisions; the 10/4 → 14/6 shift changed both the empirical pattern and its interpretation.</w:t>
       </w:r>
     </w:p>
-    <w:bookmarkEnd w:id="126"/>
-    <w:bookmarkStart w:id="132" w:name="discursive-contextual-specialisation"/>
+    <w:bookmarkEnd w:id="129"/>
+    <w:bookmarkStart w:id="135" w:name="discursive-contextual-specialisation"/>
     <w:p>
       <w:pPr>
         <w:pStyle w:val="Heading3"/>
@@ -18142,7 +18226,7 @@
         <w:rPr>
           <w:rStyle w:val="FootnoteReference"/>
         </w:rPr>
-        <w:footnoteReference w:id="127"/>
+        <w:footnoteReference w:id="130"/>
       </w:r>
       <w:r>
         <w:t xml:space="preserve"> </w:t>
@@ -18154,7 +18238,7 @@
         <w:rPr>
           <w:rStyle w:val="FootnoteReference"/>
         </w:rPr>
-        <w:footnoteReference w:id="128"/>
+        <w:footnoteReference w:id="131"/>
       </w:r>
       <w:r>
         <w:t xml:space="preserve"> </w:t>
@@ -18166,7 +18250,7 @@
         <w:rPr>
           <w:rStyle w:val="FootnoteReference"/>
         </w:rPr>
-        <w:footnoteReference w:id="129"/>
+        <w:footnoteReference w:id="132"/>
       </w:r>
       <w:r>
         <w:t xml:space="preserve"> </w:t>
@@ -18178,7 +18262,7 @@
         <w:rPr>
           <w:rStyle w:val="FootnoteReference"/>
         </w:rPr>
-        <w:footnoteReference w:id="130"/>
+        <w:footnoteReference w:id="133"/>
       </w:r>
       <w:r>
         <w:t xml:space="preserve"> </w:t>
@@ -18190,7 +18274,7 @@
         <w:rPr>
           <w:rStyle w:val="FootnoteReference"/>
         </w:rPr>
-        <w:footnoteReference w:id="131"/>
+        <w:footnoteReference w:id="134"/>
       </w:r>
       <w:r>
         <w:t xml:space="preserve"> </w:t>
@@ -18199,8 +18283,8 @@
         <w:t xml:space="preserve">extensions of the Dukes corpus.</w:t>
       </w:r>
     </w:p>
-    <w:bookmarkEnd w:id="132"/>
-    <w:bookmarkStart w:id="147" w:name="Xeb7af648a9b5037314a84f7b755228345cfdadd"/>
+    <w:bookmarkEnd w:id="135"/>
+    <w:bookmarkStart w:id="150" w:name="Xeb7af648a9b5037314a84f7b755228345cfdadd"/>
     <w:p>
       <w:pPr>
         <w:pStyle w:val="Heading3"/>
@@ -18230,7 +18314,7 @@
         <w:rPr>
           <w:rStyle w:val="FootnoteReference"/>
         </w:rPr>
-        <w:footnoteReference w:id="133"/>
+        <w:footnoteReference w:id="136"/>
       </w:r>
       <w:r>
         <w:t xml:space="preserve"> </w:t>
@@ -18725,7 +18809,7 @@
         <w:rPr>
           <w:rStyle w:val="FootnoteReference"/>
         </w:rPr>
-        <w:footnoteReference w:id="134"/>
+        <w:footnoteReference w:id="137"/>
       </w:r>
       <w:r>
         <w:t xml:space="preserve"> </w:t>
@@ -18778,7 +18862,7 @@
         <w:rPr>
           <w:rStyle w:val="FootnoteReference"/>
         </w:rPr>
-        <w:footnoteReference w:id="135"/>
+        <w:footnoteReference w:id="138"/>
       </w:r>
       <w:r>
         <w:t xml:space="preserve"> </w:t>
@@ -18888,7 +18972,7 @@
         <w:rPr>
           <w:rStyle w:val="FootnoteReference"/>
         </w:rPr>
-        <w:footnoteReference w:id="136"/>
+        <w:footnoteReference w:id="139"/>
       </w:r>
       <w:r>
         <w:t xml:space="preserve"> </w:t>
@@ -19098,7 +19182,7 @@
         <w:rPr>
           <w:rStyle w:val="FootnoteReference"/>
         </w:rPr>
-        <w:footnoteReference w:id="137"/>
+        <w:footnoteReference w:id="140"/>
       </w:r>
       <w:r>
         <w:t xml:space="preserve"> </w:t>
@@ -19110,7 +19194,7 @@
         <w:rPr>
           <w:rStyle w:val="FootnoteReference"/>
         </w:rPr>
-        <w:footnoteReference w:id="138"/>
+        <w:footnoteReference w:id="141"/>
       </w:r>
       <w:r>
         <w:t xml:space="preserve"> </w:t>
@@ -19231,7 +19315,7 @@
         <w:rPr>
           <w:rStyle w:val="FootnoteReference"/>
         </w:rPr>
-        <w:footnoteReference w:id="139"/>
+        <w:footnoteReference w:id="142"/>
       </w:r>
       <w:r>
         <w:t xml:space="preserve"> </w:t>
@@ -19322,7 +19406,7 @@
         <w:rPr>
           <w:rStyle w:val="FootnoteReference"/>
         </w:rPr>
-        <w:footnoteReference w:id="140"/>
+        <w:footnoteReference w:id="143"/>
       </w:r>
       <w:r>
         <w:t xml:space="preserve"> </w:t>
@@ -19334,7 +19418,7 @@
         <w:rPr>
           <w:rStyle w:val="FootnoteReference"/>
         </w:rPr>
-        <w:footnoteReference w:id="141"/>
+        <w:footnoteReference w:id="144"/>
       </w:r>
       <w:r>
         <w:t xml:space="preserve"> </w:t>
@@ -19525,7 +19609,7 @@
         <w:rPr>
           <w:rStyle w:val="FootnoteReference"/>
         </w:rPr>
-        <w:footnoteReference w:id="142"/>
+        <w:footnoteReference w:id="145"/>
       </w:r>
       <w:r>
         <w:t xml:space="preserve"> </w:t>
@@ -19822,7 +19906,7 @@
         <w:rPr>
           <w:rStyle w:val="FootnoteReference"/>
         </w:rPr>
-        <w:footnoteReference w:id="143"/>
+        <w:footnoteReference w:id="146"/>
       </w:r>
       <w:r>
         <w:t xml:space="preserve"> </w:t>
@@ -19856,18 +19940,18 @@
           <wp:inline>
             <wp:extent cx="5334000" cy="2445230"/>
             <wp:effectExtent b="0" l="0" r="0" t="0"/>
-            <wp:docPr descr="The ANGER-IS-A-PRESSURIZED-CONTAINER schema (after Lakoff and Kövecses, ‘Cognitive Model of Anger’), instantiated by ghaḍab → ghayẓ + kaẓm → tamayyuz. Panel 1 (S4): ghaḍab — open container, affect dissipating into language. Panel 2 (S5, Q. 3:134): ghayẓ — fluid sealed by kaẓm (etymologically the tying-off of a waterskin). Panel 3 (S5 manifestation, Q. 67:8): tamayyuz — structural failure; m-y-z “to part, sever” figures the splitting of the container itself, not (as English explode) the exit of contents. The Qur’anic instantiation is, on the conservative claim of §5.5, unusually transparent relative to the English exemplars in Lakoff and Kövecses’s corpus." title="" id="145" name="Picture"/>
+            <wp:docPr descr="The ANGER-IS-A-PRESSURIZED-CONTAINER schema (after Lakoff and Kövecses, ‘Cognitive Model of Anger’), instantiated by ghaḍab → ghayẓ + kaẓm → tamayyuz. Panel 1 (S4): ghaḍab — open container, affect dissipating into language. Panel 2 (S5, Q. 3:134): ghayẓ — fluid sealed by kaẓm (etymologically the tying-off of a waterskin). Panel 3 (S5 manifestation, Q. 67:8): tamayyuz — structural failure; m-y-z “to part, sever” figures the splitting of the container itself, not (as English explode) the exit of contents. The Qur’anic instantiation is, on the conservative claim of §5.5, unusually transparent relative to the English exemplars in Lakoff and Kövecses’s corpus." title="" id="148" name="Picture"/>
             <a:graphic>
               <a:graphicData uri="http://schemas.openxmlformats.org/drawingml/2006/picture">
                 <pic:pic>
                   <pic:nvPicPr>
-                    <pic:cNvPr descr="fig6_metaphor_v2.jpg" id="146" name="Picture"/>
+                    <pic:cNvPr descr="fig6_metaphor_v2.jpg" id="149" name="Picture"/>
                     <pic:cNvPicPr>
                       <a:picLocks noChangeArrowheads="1" noChangeAspect="1"/>
                     </pic:cNvPicPr>
                   </pic:nvPicPr>
                   <pic:blipFill>
-                    <a:blip r:embed="rId144"/>
+                    <a:blip r:embed="rId147"/>
                     <a:stretch>
                       <a:fillRect/>
                     </a:stretch>
@@ -20087,8 +20171,8 @@
         <w:t xml:space="preserve">relative to the English exemplars in Lakoff and Kövecses’s corpus.</w:t>
       </w:r>
     </w:p>
-    <w:bookmarkEnd w:id="147"/>
-    <w:bookmarkStart w:id="150" w:name="X580d141d0366f3f1fcc1a0412dd33071ff8e809"/>
+    <w:bookmarkEnd w:id="150"/>
+    <w:bookmarkStart w:id="153" w:name="X580d141d0366f3f1fcc1a0412dd33071ff8e809"/>
     <w:p>
       <w:pPr>
         <w:pStyle w:val="Heading3"/>
@@ -20224,7 +20308,7 @@
         <w:rPr>
           <w:rStyle w:val="FootnoteReference"/>
         </w:rPr>
-        <w:footnoteReference w:id="148"/>
+        <w:footnoteReference w:id="151"/>
       </w:r>
       <w:r>
         <w:t xml:space="preserve"> </w:t>
@@ -20236,7 +20320,7 @@
         <w:rPr>
           <w:rStyle w:val="FootnoteReference"/>
         </w:rPr>
-        <w:footnoteReference w:id="149"/>
+        <w:footnoteReference w:id="152"/>
       </w:r>
       <w:r>
         <w:t xml:space="preserve"> </w:t>
@@ -20531,8 +20615,8 @@
         <w:t xml:space="preserve">A second conditional implication, which we register as a hypothesis rather than a recommendation, is that pedagogical translations may benefit from marking each lexeme’s position on the continuum (by inline gloss, footnote, or chromatic coding) — but the empirical case for this rests on the comparative comprehension study we commend to future work. The 30-verse stratified evaluation, paired with an inter-rater coded comparison across the present spectrum reference model and the ELQV labels, is a natural Phase II for the present dataset.</w:t>
       </w:r>
     </w:p>
-    <w:bookmarkEnd w:id="150"/>
-    <w:bookmarkStart w:id="151" w:name="implications-for-islamic-psychology"/>
+    <w:bookmarkEnd w:id="153"/>
+    <w:bookmarkStart w:id="154" w:name="implications-for-islamic-psychology"/>
     <w:p>
       <w:pPr>
         <w:pStyle w:val="Heading3"/>
@@ -20682,9 +20766,9 @@
         </w:pict>
       </w:r>
     </w:p>
-    <w:bookmarkEnd w:id="151"/>
-    <w:bookmarkEnd w:id="152"/>
-    <w:bookmarkStart w:id="161" w:name="conclusion"/>
+    <w:bookmarkEnd w:id="154"/>
+    <w:bookmarkEnd w:id="155"/>
+    <w:bookmarkStart w:id="164" w:name="conclusion"/>
     <w:p>
       <w:pPr>
         <w:pStyle w:val="Heading2"/>
@@ -20693,7 +20777,7 @@
         <w:t xml:space="preserve">6. Conclusion</w:t>
       </w:r>
     </w:p>
-    <w:bookmarkStart w:id="155" w:name="substantive-contributions"/>
+    <w:bookmarkStart w:id="158" w:name="substantive-contributions"/>
     <w:p>
       <w:pPr>
         <w:pStyle w:val="Heading3"/>
@@ -20728,7 +20812,7 @@
         <w:rPr>
           <w:rStyle w:val="FootnoteReference"/>
         </w:rPr>
-        <w:footnoteReference w:id="153"/>
+        <w:footnoteReference w:id="156"/>
       </w:r>
       <w:r>
         <w:t xml:space="preserve"> </w:t>
@@ -20740,7 +20824,7 @@
         <w:rPr>
           <w:rStyle w:val="FootnoteReference"/>
         </w:rPr>
-        <w:footnoteReference w:id="154"/>
+        <w:footnoteReference w:id="157"/>
       </w:r>
       <w:r>
         <w:t xml:space="preserve"> </w:t>
@@ -21007,8 +21091,8 @@
         <w:t xml:space="preserve">) as the one clear Northwest-Semitic precedent for vessel-rupture imagery and accordingly tempers any strong uniqueness reading.</w:t>
       </w:r>
     </w:p>
-    <w:bookmarkEnd w:id="155"/>
-    <w:bookmarkStart w:id="156" w:name="answers-to-the-research-questions"/>
+    <w:bookmarkEnd w:id="158"/>
+    <w:bookmarkStart w:id="159" w:name="answers-to-the-research-questions"/>
     <w:p>
       <w:pPr>
         <w:pStyle w:val="Heading3"/>
@@ -21787,8 +21871,8 @@
         <w:t xml:space="preserve">framework. All practical implications are framed as hypotheses for empirical follow-up, not as settled prescriptions.</w:t>
       </w:r>
     </w:p>
-    <w:bookmarkEnd w:id="156"/>
-    <w:bookmarkStart w:id="159" w:name="limitations-and-future-work"/>
+    <w:bookmarkEnd w:id="159"/>
+    <w:bookmarkStart w:id="162" w:name="limitations-and-future-work"/>
     <w:p>
       <w:pPr>
         <w:pStyle w:val="Heading3"/>
@@ -21840,7 +21924,7 @@
         <w:rPr>
           <w:rStyle w:val="FootnoteReference"/>
         </w:rPr>
-        <w:footnoteReference w:id="157"/>
+        <w:footnoteReference w:id="160"/>
       </w:r>
       <w:r>
         <w:t xml:space="preserve"> </w:t>
@@ -21852,7 +21936,7 @@
         <w:rPr>
           <w:rStyle w:val="FootnoteReference"/>
         </w:rPr>
-        <w:footnoteReference w:id="158"/>
+        <w:footnoteReference w:id="161"/>
       </w:r>
       <w:r>
         <w:t xml:space="preserve"> </w:t>
@@ -22158,8 +22242,8 @@
         <w:t xml:space="preserve">— not a replacement for — the classical philological and exegetical tradition, and the load-bearing claims rest on the convergence of the two registers.</w:t>
       </w:r>
     </w:p>
-    <w:bookmarkEnd w:id="159"/>
-    <w:bookmarkStart w:id="160" w:name="closing-remark"/>
+    <w:bookmarkEnd w:id="162"/>
+    <w:bookmarkStart w:id="163" w:name="closing-remark"/>
     <w:p>
       <w:pPr>
         <w:pStyle w:val="Heading3"/>
@@ -22183,9 +22267,9 @@
         </w:pict>
       </w:r>
     </w:p>
-    <w:bookmarkEnd w:id="160"/>
-    <w:bookmarkEnd w:id="161"/>
-    <w:bookmarkStart w:id="162" w:name="acknowledgements"/>
+    <w:bookmarkEnd w:id="163"/>
+    <w:bookmarkEnd w:id="164"/>
+    <w:bookmarkStart w:id="165" w:name="acknowledgements"/>
     <w:p>
       <w:pPr>
         <w:pStyle w:val="Heading2"/>
@@ -22218,8 +22302,8 @@
         <w:t xml:space="preserve">baseline-sensitivity question), and the reproducibility of the analysis pipeline.</w:t>
       </w:r>
     </w:p>
-    <w:bookmarkEnd w:id="162"/>
-    <w:bookmarkStart w:id="163" w:name="funding"/>
+    <w:bookmarkEnd w:id="165"/>
+    <w:bookmarkStart w:id="166" w:name="funding"/>
     <w:p>
       <w:pPr>
         <w:pStyle w:val="Heading2"/>
@@ -22236,8 +22320,8 @@
         <w:t xml:space="preserve">This research received no specific grant from any funding agency in the public, commercial, or not-for-profit sectors.</w:t>
       </w:r>
     </w:p>
-    <w:bookmarkEnd w:id="163"/>
-    <w:bookmarkStart w:id="164" w:name="competing-interests"/>
+    <w:bookmarkEnd w:id="166"/>
+    <w:bookmarkStart w:id="167" w:name="competing-interests"/>
     <w:p>
       <w:pPr>
         <w:pStyle w:val="Heading2"/>
@@ -22254,8 +22338,8 @@
         <w:t xml:space="preserve">The authors declare no competing financial or non-financial interests.</w:t>
       </w:r>
     </w:p>
-    <w:bookmarkEnd w:id="164"/>
-    <w:bookmarkStart w:id="165" w:name="ethics-statement"/>
+    <w:bookmarkEnd w:id="167"/>
+    <w:bookmarkStart w:id="168" w:name="ethics-statement"/>
     <w:p>
       <w:pPr>
         <w:pStyle w:val="Heading2"/>
@@ -22272,8 +22356,8 @@
         <w:t xml:space="preserve">This study uses only publicly-released text-corpus data (the Quranic Arabic Corpus, GPL-licensed; the Tanzil Quran text, CC-BY-ND 3.0). No human or animal subjects were involved at any stage. As a corpus-only philological-computational analysis, the work is exempt from human-subjects review under the standards of Urmia University and of comparable institutions.</w:t>
       </w:r>
     </w:p>
-    <w:bookmarkEnd w:id="165"/>
-    <w:bookmarkStart w:id="166" w:name="author-contributions"/>
+    <w:bookmarkEnd w:id="168"/>
+    <w:bookmarkStart w:id="169" w:name="author-contributions"/>
     <w:p>
       <w:pPr>
         <w:pStyle w:val="Heading2"/>
@@ -22290,8 +22374,8 @@
         <w:t xml:space="preserve">K.J. (corresponding author) conceived the project, developed the theoretical framework, conducted the lexicographic and tafsir-tradition analysis, drafted the manuscript, and is responsible for the final form of the argument. A.J. contributed to the theoretical framework, the design of the computational pipeline, and editorial revision. Both authors approved the final manuscript and are jointly accountable for its content.</w:t>
       </w:r>
     </w:p>
-    <w:bookmarkEnd w:id="166"/>
-    <w:bookmarkStart w:id="167" w:name="author-affiliations-and-orcid"/>
+    <w:bookmarkEnd w:id="169"/>
+    <w:bookmarkStart w:id="170" w:name="author-affiliations-and-orcid"/>
     <w:p>
       <w:pPr>
         <w:pStyle w:val="Heading2"/>
@@ -22383,8 +22467,8 @@
         <w:t xml:space="preserve">Karim Jabbary: 0000-0000-0000-0000 (to be provided at submission). Ali Jabbary: 0000-0000-0000-0000 (to be provided at submission).</w:t>
       </w:r>
     </w:p>
-    <w:bookmarkEnd w:id="167"/>
-    <w:bookmarkStart w:id="170" w:name="data-and-code-availability"/>
+    <w:bookmarkEnd w:id="170"/>
+    <w:bookmarkStart w:id="173" w:name="data-and-code-availability"/>
     <w:p>
       <w:pPr>
         <w:pStyle w:val="Heading2"/>
@@ -22405,7 +22489,7 @@
       <w:pPr>
         <w:pStyle w:val="BlockText"/>
       </w:pPr>
-      <w:hyperlink r:id="rId168">
+      <w:hyperlink r:id="rId171">
         <w:r>
           <w:rPr>
             <w:rStyle w:val="Hyperlink"/>
@@ -22425,7 +22509,7 @@
         <w:rPr>
           <w:rStyle w:val="FootnoteReference"/>
         </w:rPr>
-        <w:footnoteReference w:id="169"/>
+        <w:footnoteReference w:id="172"/>
       </w:r>
       <w:r>
         <w:t xml:space="preserve"> </w:t>
@@ -22548,8 +22632,8 @@
         </w:pict>
       </w:r>
     </w:p>
-    <w:bookmarkEnd w:id="170"/>
-    <w:bookmarkStart w:id="174" w:name="bibliography"/>
+    <w:bookmarkEnd w:id="173"/>
+    <w:bookmarkStart w:id="177" w:name="bibliography"/>
     <w:p>
       <w:pPr>
         <w:pStyle w:val="Heading2"/>
@@ -22595,7 +22679,7 @@
         <w:t xml:space="preserve">is ignored for alphabetisation.</w:t>
       </w:r>
     </w:p>
-    <w:bookmarkStart w:id="171" w:name="classical-arabic-lexica-and-tafsīr"/>
+    <w:bookmarkStart w:id="174" w:name="classical-arabic-lexica-and-tafsīr"/>
     <w:p>
       <w:pPr>
         <w:pStyle w:val="Heading3"/>
@@ -22950,8 +23034,8 @@
         <w:t xml:space="preserve">. Beirut: Dār al-Kitāb al-ʿArabī, 1407 AH/1986.</w:t>
       </w:r>
     </w:p>
-    <w:bookmarkEnd w:id="171"/>
-    <w:bookmarkStart w:id="172" w:name="persian-language-scholarship"/>
+    <w:bookmarkEnd w:id="174"/>
+    <w:bookmarkStart w:id="175" w:name="persian-language-scholarship"/>
     <w:p>
       <w:pPr>
         <w:pStyle w:val="Heading3"/>
@@ -23207,8 +23291,8 @@
         <w:t xml:space="preserve">در قرآن کریم با رویکردی بر زبان‌شناختی».</w:t>
       </w:r>
     </w:p>
-    <w:bookmarkEnd w:id="172"/>
-    <w:bookmarkStart w:id="173" w:name="english-language-scholarship"/>
+    <w:bookmarkEnd w:id="175"/>
+    <w:bookmarkStart w:id="176" w:name="english-language-scholarship"/>
     <w:p>
       <w:pPr>
         <w:pStyle w:val="Heading3"/>
@@ -25144,9 +25228,9 @@
         <w:t xml:space="preserve">10:2 (1995), pp. 59-92. DOI: 10.1207/s15327868ms1002_1.</w:t>
       </w:r>
     </w:p>
-    <w:bookmarkEnd w:id="173"/>
-    <w:bookmarkEnd w:id="174"/>
-    <w:bookmarkEnd w:id="175"/>
+    <w:bookmarkEnd w:id="176"/>
+    <w:bookmarkEnd w:id="177"/>
+    <w:bookmarkEnd w:id="178"/>
     <w:sectPr/>
   </w:body>
 </w:document>
@@ -26688,7 +26772,7 @@
       </w:r>
     </w:p>
   </w:footnote>
-  <w:footnote w:id="71">
+  <w:footnote w:id="74">
     <w:p>
       <w:pPr>
         <w:pStyle w:val="FootnoteText"/>
@@ -26729,50 +26813,6 @@
       </w:r>
       <w:r>
         <w:t xml:space="preserve">(2024).</w:t>
-      </w:r>
-    </w:p>
-  </w:footnote>
-  <w:footnote w:id="72">
-    <w:p>
-      <w:pPr>
-        <w:pStyle w:val="FootnoteText"/>
-      </w:pPr>
-      <w:r>
-        <w:rPr>
-          <w:rStyle w:val="FootnoteReference"/>
-        </w:rPr>
-        <w:footnoteRef/>
-      </w:r>
-      <w:r>
-        <w:t xml:space="preserve"> </w:t>
-      </w:r>
-      <w:r>
-        <w:t xml:space="preserve">E.g. M. Nandan, I. Godbole, P. Kapparad and S. Bhattacharjee,</w:t>
-      </w:r>
-      <w:r>
-        <w:t xml:space="preserve"> </w:t>
-      </w:r>
-      <w:r>
-        <w:t xml:space="preserve">‘Comparative Analysis of Religious Texts: NLP Approaches to the Bible, Quran, and Bhagavad Gītā’</w:t>
-      </w:r>
-      <w:r>
-        <w:t xml:space="preserve">, in</w:t>
-      </w:r>
-      <w:r>
-        <w:t xml:space="preserve"> </w:t>
-      </w:r>
-      <w:r>
-        <w:rPr>
-          <w:i/>
-          <w:iCs/>
-        </w:rPr>
-        <w:t xml:space="preserve">Proceedings of the Workshop on New Horizons in Computational Linguistics for Religious Texts (CLRel)</w:t>
-      </w:r>
-      <w:r>
-        <w:t xml:space="preserve"> </w:t>
-      </w:r>
-      <w:r>
-        <w:t xml:space="preserve">(Stroudsburg, PA: Association for Computational Linguistics, 2025).</w:t>
       </w:r>
     </w:p>
   </w:footnote>
@@ -26791,133 +26831,32 @@
         <w:t xml:space="preserve"> </w:t>
       </w:r>
       <w:r>
-        <w:t xml:space="preserve">William G. Cochran,</w:t>
-      </w:r>
-      <w:r>
-        <w:t xml:space="preserve"> </w:t>
-      </w:r>
-      <w:r>
-        <w:t xml:space="preserve">‘Some Methods for Strengthening the Common χ² Tests’</w:t>
-      </w:r>
-      <w:r>
-        <w:t xml:space="preserve">,</w:t>
-      </w:r>
-      <w:r>
-        <w:t xml:space="preserve"> </w:t>
-      </w:r>
-      <w:r>
-        <w:rPr>
-          <w:i/>
-          <w:iCs/>
-        </w:rPr>
-        <w:t xml:space="preserve">Biometrics</w:t>
-      </w:r>
-      <w:r>
-        <w:t xml:space="preserve"> </w:t>
-      </w:r>
-      <w:r>
-        <w:t xml:space="preserve">10:4 (1954), pp. 417-451.</w:t>
-      </w:r>
-    </w:p>
-  </w:footnote>
-  <w:footnote w:id="76">
-    <w:p>
-      <w:pPr>
-        <w:pStyle w:val="FootnoteText"/>
-      </w:pPr>
-      <w:r>
-        <w:rPr>
-          <w:rStyle w:val="FootnoteReference"/>
-        </w:rPr>
-        <w:footnoteRef/>
-      </w:r>
-      <w:r>
-        <w:t xml:space="preserve"> </w:t>
-      </w:r>
-      <w:r>
-        <w:t xml:space="preserve">R. A. Fisher,</w:t>
-      </w:r>
-      <w:r>
-        <w:t xml:space="preserve"> </w:t>
-      </w:r>
-      <w:r>
-        <w:t xml:space="preserve">‘On the Interpretation of χ² from Contingency Tables, and the Calculation of</w:t>
-      </w:r>
-      <w:r>
-        <w:t xml:space="preserve"> </w:t>
-      </w:r>
-      <w:r>
-        <w:rPr>
-          <w:i/>
-          <w:iCs/>
-        </w:rPr>
-        <w:t xml:space="preserve">p</w:t>
-      </w:r>
-      <w:r>
-        <w:t xml:space="preserve">’</w:t>
-      </w:r>
-      <w:r>
-        <w:t xml:space="preserve">,</w:t>
-      </w:r>
-      <w:r>
-        <w:t xml:space="preserve"> </w:t>
-      </w:r>
-      <w:r>
-        <w:rPr>
-          <w:i/>
-          <w:iCs/>
-        </w:rPr>
-        <w:t xml:space="preserve">Journal of the Royal Statistical Society</w:t>
-      </w:r>
-      <w:r>
-        <w:t xml:space="preserve"> </w:t>
-      </w:r>
-      <w:r>
-        <w:t xml:space="preserve">85:1 (1922), pp. 87-94.</w:t>
-      </w:r>
-    </w:p>
-  </w:footnote>
-  <w:footnote w:id="77">
-    <w:p>
-      <w:pPr>
-        <w:pStyle w:val="FootnoteText"/>
-      </w:pPr>
-      <w:r>
-        <w:rPr>
-          <w:rStyle w:val="FootnoteReference"/>
-        </w:rPr>
-        <w:footnoteRef/>
-      </w:r>
-      <w:r>
-        <w:t xml:space="preserve"> </w:t>
-      </w:r>
-      <w:r>
-        <w:t xml:space="preserve">W. M. Patefield,</w:t>
-      </w:r>
-      <w:r>
-        <w:t xml:space="preserve"> </w:t>
-      </w:r>
-      <w:r>
-        <w:t xml:space="preserve">‘An Efficient Method of Generating Random R × C Tables with Given Row and Column Totals’</w:t>
-      </w:r>
-      <w:r>
-        <w:t xml:space="preserve">,</w:t>
-      </w:r>
-      <w:r>
-        <w:t xml:space="preserve"> </w:t>
-      </w:r>
-      <w:r>
-        <w:rPr>
-          <w:i/>
-          <w:iCs/>
-        </w:rPr>
-        <w:t xml:space="preserve">Applied Statistics</w:t>
-      </w:r>
-      <w:r>
-        <w:t xml:space="preserve"> </w:t>
-      </w:r>
-      <w:r>
-        <w:t xml:space="preserve">30:1 (1981), pp. 91-97.</w:t>
+        <w:t xml:space="preserve">E.g. M. Nandan, I. Godbole, P. Kapparad and S. Bhattacharjee,</w:t>
+      </w:r>
+      <w:r>
+        <w:t xml:space="preserve"> </w:t>
+      </w:r>
+      <w:r>
+        <w:t xml:space="preserve">‘Comparative Analysis of Religious Texts: NLP Approaches to the Bible, Quran, and Bhagavad Gītā’</w:t>
+      </w:r>
+      <w:r>
+        <w:t xml:space="preserve">, in</w:t>
+      </w:r>
+      <w:r>
+        <w:t xml:space="preserve"> </w:t>
+      </w:r>
+      <w:r>
+        <w:rPr>
+          <w:i/>
+          <w:iCs/>
+        </w:rPr>
+        <w:t xml:space="preserve">Proceedings of the Workshop on New Horizons in Computational Linguistics for Religious Texts (CLRel)</w:t>
+      </w:r>
+      <w:r>
+        <w:t xml:space="preserve"> </w:t>
+      </w:r>
+      <w:r>
+        <w:t xml:space="preserve">(Stroudsburg, PA: Association for Computational Linguistics, 2025).</w:t>
       </w:r>
     </w:p>
   </w:footnote>
@@ -26936,45 +26875,13 @@
         <w:t xml:space="preserve"> </w:t>
       </w:r>
       <w:r>
-        <w:t xml:space="preserve">Cyrus R. Mehta and Nitin R. Patel,</w:t>
-      </w:r>
-      <w:r>
-        <w:t xml:space="preserve"> </w:t>
-      </w:r>
-      <w:r>
-        <w:t xml:space="preserve">‘A Network Algorithm for Performing Fisher’s Exact Test in</w:t>
-      </w:r>
-      <w:r>
-        <w:t xml:space="preserve"> </w:t>
-      </w:r>
-      <w:r>
-        <w:rPr>
-          <w:i/>
-          <w:iCs/>
-        </w:rPr>
-        <w:t xml:space="preserve">r</w:t>
-      </w:r>
-      <w:r>
-        <w:t xml:space="preserve"> </w:t>
-      </w:r>
-      <w:r>
-        <w:t xml:space="preserve">×</w:t>
-      </w:r>
-      <w:r>
-        <w:t xml:space="preserve"> </w:t>
-      </w:r>
-      <w:r>
-        <w:rPr>
-          <w:i/>
-          <w:iCs/>
-        </w:rPr>
-        <w:t xml:space="preserve">c</w:t>
-      </w:r>
-      <w:r>
-        <w:t xml:space="preserve"> </w:t>
-      </w:r>
-      <w:r>
-        <w:t xml:space="preserve">Contingency Tables’</w:t>
+        <w:t xml:space="preserve">William G. Cochran,</w:t>
+      </w:r>
+      <w:r>
+        <w:t xml:space="preserve"> </w:t>
+      </w:r>
+      <w:r>
+        <w:t xml:space="preserve">‘Some Methods for Strengthening the Common χ² Tests’</w:t>
       </w:r>
       <w:r>
         <w:t xml:space="preserve">,</w:t>
@@ -26987,13 +26894,13 @@
           <w:i/>
           <w:iCs/>
         </w:rPr>
-        <w:t xml:space="preserve">Journal of the American Statistical Association</w:t>
-      </w:r>
-      <w:r>
-        <w:t xml:space="preserve"> </w:t>
-      </w:r>
-      <w:r>
-        <w:t xml:space="preserve">78:382 (1983), pp. 427-434.</w:t>
+        <w:t xml:space="preserve">Biometrics</w:t>
+      </w:r>
+      <w:r>
+        <w:t xml:space="preserve"> </w:t>
+      </w:r>
+      <w:r>
+        <w:t xml:space="preserve">10:4 (1954), pp. 417-451.</w:t>
       </w:r>
     </w:p>
   </w:footnote>
@@ -27012,6 +26919,183 @@
         <w:t xml:space="preserve"> </w:t>
       </w:r>
       <w:r>
+        <w:t xml:space="preserve">R. A. Fisher,</w:t>
+      </w:r>
+      <w:r>
+        <w:t xml:space="preserve"> </w:t>
+      </w:r>
+      <w:r>
+        <w:t xml:space="preserve">‘On the Interpretation of χ² from Contingency Tables, and the Calculation of</w:t>
+      </w:r>
+      <w:r>
+        <w:t xml:space="preserve"> </w:t>
+      </w:r>
+      <w:r>
+        <w:rPr>
+          <w:i/>
+          <w:iCs/>
+        </w:rPr>
+        <w:t xml:space="preserve">p</w:t>
+      </w:r>
+      <w:r>
+        <w:t xml:space="preserve">’</w:t>
+      </w:r>
+      <w:r>
+        <w:t xml:space="preserve">,</w:t>
+      </w:r>
+      <w:r>
+        <w:t xml:space="preserve"> </w:t>
+      </w:r>
+      <w:r>
+        <w:rPr>
+          <w:i/>
+          <w:iCs/>
+        </w:rPr>
+        <w:t xml:space="preserve">Journal of the Royal Statistical Society</w:t>
+      </w:r>
+      <w:r>
+        <w:t xml:space="preserve"> </w:t>
+      </w:r>
+      <w:r>
+        <w:t xml:space="preserve">85:1 (1922), pp. 87-94.</w:t>
+      </w:r>
+    </w:p>
+  </w:footnote>
+  <w:footnote w:id="80">
+    <w:p>
+      <w:pPr>
+        <w:pStyle w:val="FootnoteText"/>
+      </w:pPr>
+      <w:r>
+        <w:rPr>
+          <w:rStyle w:val="FootnoteReference"/>
+        </w:rPr>
+        <w:footnoteRef/>
+      </w:r>
+      <w:r>
+        <w:t xml:space="preserve"> </w:t>
+      </w:r>
+      <w:r>
+        <w:t xml:space="preserve">W. M. Patefield,</w:t>
+      </w:r>
+      <w:r>
+        <w:t xml:space="preserve"> </w:t>
+      </w:r>
+      <w:r>
+        <w:t xml:space="preserve">‘An Efficient Method of Generating Random R × C Tables with Given Row and Column Totals’</w:t>
+      </w:r>
+      <w:r>
+        <w:t xml:space="preserve">,</w:t>
+      </w:r>
+      <w:r>
+        <w:t xml:space="preserve"> </w:t>
+      </w:r>
+      <w:r>
+        <w:rPr>
+          <w:i/>
+          <w:iCs/>
+        </w:rPr>
+        <w:t xml:space="preserve">Applied Statistics</w:t>
+      </w:r>
+      <w:r>
+        <w:t xml:space="preserve"> </w:t>
+      </w:r>
+      <w:r>
+        <w:t xml:space="preserve">30:1 (1981), pp. 91-97.</w:t>
+      </w:r>
+    </w:p>
+  </w:footnote>
+  <w:footnote w:id="81">
+    <w:p>
+      <w:pPr>
+        <w:pStyle w:val="FootnoteText"/>
+      </w:pPr>
+      <w:r>
+        <w:rPr>
+          <w:rStyle w:val="FootnoteReference"/>
+        </w:rPr>
+        <w:footnoteRef/>
+      </w:r>
+      <w:r>
+        <w:t xml:space="preserve"> </w:t>
+      </w:r>
+      <w:r>
+        <w:t xml:space="preserve">Cyrus R. Mehta and Nitin R. Patel,</w:t>
+      </w:r>
+      <w:r>
+        <w:t xml:space="preserve"> </w:t>
+      </w:r>
+      <w:r>
+        <w:t xml:space="preserve">‘A Network Algorithm for Performing Fisher’s Exact Test in</w:t>
+      </w:r>
+      <w:r>
+        <w:t xml:space="preserve"> </w:t>
+      </w:r>
+      <w:r>
+        <w:rPr>
+          <w:i/>
+          <w:iCs/>
+        </w:rPr>
+        <w:t xml:space="preserve">r</w:t>
+      </w:r>
+      <w:r>
+        <w:t xml:space="preserve"> </w:t>
+      </w:r>
+      <w:r>
+        <w:t xml:space="preserve">×</w:t>
+      </w:r>
+      <w:r>
+        <w:t xml:space="preserve"> </w:t>
+      </w:r>
+      <w:r>
+        <w:rPr>
+          <w:i/>
+          <w:iCs/>
+        </w:rPr>
+        <w:t xml:space="preserve">c</w:t>
+      </w:r>
+      <w:r>
+        <w:t xml:space="preserve"> </w:t>
+      </w:r>
+      <w:r>
+        <w:t xml:space="preserve">Contingency Tables’</w:t>
+      </w:r>
+      <w:r>
+        <w:t xml:space="preserve">,</w:t>
+      </w:r>
+      <w:r>
+        <w:t xml:space="preserve"> </w:t>
+      </w:r>
+      <w:r>
+        <w:rPr>
+          <w:i/>
+          <w:iCs/>
+        </w:rPr>
+        <w:t xml:space="preserve">Journal of the American Statistical Association</w:t>
+      </w:r>
+      <w:r>
+        <w:t xml:space="preserve"> </w:t>
+      </w:r>
+      <w:r>
+        <w:t xml:space="preserve">78:382 (1983), pp. 427-434.</w:t>
+      </w:r>
+    </w:p>
+  </w:footnote>
+  <w:footnote w:id="82">
+    <w:p>
+      <w:pPr>
+        <w:pStyle w:val="FootnoteText"/>
+      </w:pPr>
+      <w:r>
+        <w:rPr>
+          <w:rStyle w:val="FootnoteReference"/>
+        </w:rPr>
+        <w:footnoteRef/>
+      </w:r>
+      <w:r>
+        <w:t xml:space="preserve"> </w:t>
+      </w:r>
+      <w:r>
         <w:t xml:space="preserve">Alan Agresti,</w:t>
       </w:r>
       <w:r>
@@ -27029,7 +27113,7 @@
       </w:r>
     </w:p>
   </w:footnote>
-  <w:footnote w:id="83">
+  <w:footnote w:id="86">
     <w:p>
       <w:pPr>
         <w:pStyle w:val="FootnoteText"/>
@@ -27073,7 +27157,7 @@
       </w:r>
     </w:p>
   </w:footnote>
-  <w:footnote w:id="96">
+  <w:footnote w:id="99">
     <w:p>
       <w:pPr>
         <w:pStyle w:val="FootnoteText"/>
@@ -27099,34 +27183,6 @@
           <w:iCs/>
         </w:rPr>
         <w:t xml:space="preserve">Metaphor and Emotion</w:t>
-      </w:r>
-      <w:r>
-        <w:t xml:space="preserve">.</w:t>
-      </w:r>
-    </w:p>
-  </w:footnote>
-  <w:footnote w:id="98">
-    <w:p>
-      <w:pPr>
-        <w:pStyle w:val="FootnoteText"/>
-      </w:pPr>
-      <w:r>
-        <w:rPr>
-          <w:rStyle w:val="FootnoteReference"/>
-        </w:rPr>
-        <w:footnoteRef/>
-      </w:r>
-      <w:r>
-        <w:t xml:space="preserve"> </w:t>
-      </w:r>
-      <w:r>
-        <w:t xml:space="preserve">Narimani, Iqbali and Chari,</w:t>
-      </w:r>
-      <w:r>
-        <w:t xml:space="preserve"> </w:t>
-      </w:r>
-      <w:r>
-        <w:t xml:space="preserve">‘Semantic Re-analysis’</w:t>
       </w:r>
       <w:r>
         <w:t xml:space="preserve">.</w:t>
@@ -27148,41 +27204,13 @@
         <w:t xml:space="preserve"> </w:t>
       </w:r>
       <w:r>
-        <w:t xml:space="preserve">Lakoff and Kövecses,</w:t>
-      </w:r>
-      <w:r>
-        <w:t xml:space="preserve"> </w:t>
-      </w:r>
-      <w:r>
-        <w:t xml:space="preserve">‘Cognitive Model of Anger’</w:t>
-      </w:r>
-      <w:r>
-        <w:t xml:space="preserve">.</w:t>
-      </w:r>
-    </w:p>
-  </w:footnote>
-  <w:footnote w:id="102">
-    <w:p>
-      <w:pPr>
-        <w:pStyle w:val="FootnoteText"/>
-      </w:pPr>
-      <w:r>
-        <w:rPr>
-          <w:rStyle w:val="FootnoteReference"/>
-        </w:rPr>
-        <w:footnoteRef/>
-      </w:r>
-      <w:r>
-        <w:t xml:space="preserve"> </w:t>
-      </w:r>
-      <w:r>
-        <w:t xml:space="preserve">Lakoff and Kövecses,</w:t>
-      </w:r>
-      <w:r>
-        <w:t xml:space="preserve"> </w:t>
-      </w:r>
-      <w:r>
-        <w:t xml:space="preserve">‘Cognitive Model of Anger’</w:t>
+        <w:t xml:space="preserve">Narimani, Iqbali and Chari,</w:t>
+      </w:r>
+      <w:r>
+        <w:t xml:space="preserve"> </w:t>
+      </w:r>
+      <w:r>
+        <w:t xml:space="preserve">‘Semantic Re-analysis’</w:t>
       </w:r>
       <w:r>
         <w:t xml:space="preserve">.</w:t>
@@ -27204,23 +27232,16 @@
         <w:t xml:space="preserve"> </w:t>
       </w:r>
       <w:r>
-        <w:t xml:space="preserve">Richard S. Lazarus,</w:t>
-      </w:r>
-      <w:r>
-        <w:t xml:space="preserve"> </w:t>
-      </w:r>
-      <w:r>
-        <w:rPr>
-          <w:i/>
-          <w:iCs/>
-        </w:rPr>
-        <w:t xml:space="preserve">Emotion and Adaptation</w:t>
-      </w:r>
-      <w:r>
-        <w:t xml:space="preserve"> </w:t>
-      </w:r>
-      <w:r>
-        <w:t xml:space="preserve">(New York: Oxford University Press, 1991).</w:t>
+        <w:t xml:space="preserve">Lakoff and Kövecses,</w:t>
+      </w:r>
+      <w:r>
+        <w:t xml:space="preserve"> </w:t>
+      </w:r>
+      <w:r>
+        <w:t xml:space="preserve">‘Cognitive Model of Anger’</w:t>
+      </w:r>
+      <w:r>
+        <w:t xml:space="preserve">.</w:t>
       </w:r>
     </w:p>
   </w:footnote>
@@ -27239,101 +27260,16 @@
         <w:t xml:space="preserve"> </w:t>
       </w:r>
       <w:r>
-        <w:t xml:space="preserve">Klaus R. Scherer,</w:t>
-      </w:r>
-      <w:r>
-        <w:t xml:space="preserve"> </w:t>
-      </w:r>
-      <w:r>
-        <w:t xml:space="preserve">‘Appraisal Considered as a Process of Multilevel Sequential Checking’</w:t>
-      </w:r>
-      <w:r>
-        <w:t xml:space="preserve">, in Klaus R. Scherer, Angela Schorr and Tom Johnstone (eds),</w:t>
-      </w:r>
-      <w:r>
-        <w:t xml:space="preserve"> </w:t>
-      </w:r>
-      <w:r>
-        <w:rPr>
-          <w:i/>
-          <w:iCs/>
-        </w:rPr>
-        <w:t xml:space="preserve">Appraisal Processes in Emotion: Theory, Methods, Research</w:t>
-      </w:r>
-      <w:r>
-        <w:t xml:space="preserve"> </w:t>
-      </w:r>
-      <w:r>
-        <w:t xml:space="preserve">(New York: Oxford University Press, 2001), pp. 92-120; idem,</w:t>
-      </w:r>
-      <w:r>
-        <w:t xml:space="preserve"> </w:t>
-      </w:r>
-      <w:r>
-        <w:t xml:space="preserve">‘What Are Emotions? And How Can They Be Measured?’</w:t>
-      </w:r>
-      <w:r>
-        <w:t xml:space="preserve">,</w:t>
-      </w:r>
-      <w:r>
-        <w:t xml:space="preserve"> </w:t>
-      </w:r>
-      <w:r>
-        <w:rPr>
-          <w:i/>
-          <w:iCs/>
-        </w:rPr>
-        <w:t xml:space="preserve">Social Science Information</w:t>
-      </w:r>
-      <w:r>
-        <w:t xml:space="preserve"> </w:t>
-      </w:r>
-      <w:r>
-        <w:t xml:space="preserve">44:4 (2005), pp. 695-729.</w:t>
-      </w:r>
-    </w:p>
-  </w:footnote>
-  <w:footnote w:id="106">
-    <w:p>
-      <w:pPr>
-        <w:pStyle w:val="FootnoteText"/>
-      </w:pPr>
-      <w:r>
-        <w:rPr>
-          <w:rStyle w:val="FootnoteReference"/>
-        </w:rPr>
-        <w:footnoteRef/>
-      </w:r>
-      <w:r>
-        <w:t xml:space="preserve"> </w:t>
-      </w:r>
-      <w:r>
-        <w:t xml:space="preserve">Ira J. Roseman,</w:t>
-      </w:r>
-      <w:r>
-        <w:t xml:space="preserve"> </w:t>
-      </w:r>
-      <w:r>
-        <w:t xml:space="preserve">‘Appraisal Determinants of Emotions: Constructing a More Accurate and Comprehensive Theory’</w:t>
-      </w:r>
-      <w:r>
-        <w:t xml:space="preserve">,</w:t>
-      </w:r>
-      <w:r>
-        <w:t xml:space="preserve"> </w:t>
-      </w:r>
-      <w:r>
-        <w:rPr>
-          <w:i/>
-          <w:iCs/>
-        </w:rPr>
-        <w:t xml:space="preserve">Cognition and Emotion</w:t>
-      </w:r>
-      <w:r>
-        <w:t xml:space="preserve"> </w:t>
-      </w:r>
-      <w:r>
-        <w:t xml:space="preserve">10:3 (1996), pp. 241-277.</w:t>
+        <w:t xml:space="preserve">Lakoff and Kövecses,</w:t>
+      </w:r>
+      <w:r>
+        <w:t xml:space="preserve"> </w:t>
+      </w:r>
+      <w:r>
+        <w:t xml:space="preserve">‘Cognitive Model of Anger’</w:t>
+      </w:r>
+      <w:r>
+        <w:t xml:space="preserve">.</w:t>
       </w:r>
     </w:p>
   </w:footnote>
@@ -27352,6 +27288,154 @@
         <w:t xml:space="preserve"> </w:t>
       </w:r>
       <w:r>
+        <w:t xml:space="preserve">Richard S. Lazarus,</w:t>
+      </w:r>
+      <w:r>
+        <w:t xml:space="preserve"> </w:t>
+      </w:r>
+      <w:r>
+        <w:rPr>
+          <w:i/>
+          <w:iCs/>
+        </w:rPr>
+        <w:t xml:space="preserve">Emotion and Adaptation</w:t>
+      </w:r>
+      <w:r>
+        <w:t xml:space="preserve"> </w:t>
+      </w:r>
+      <w:r>
+        <w:t xml:space="preserve">(New York: Oxford University Press, 1991).</w:t>
+      </w:r>
+    </w:p>
+  </w:footnote>
+  <w:footnote w:id="108">
+    <w:p>
+      <w:pPr>
+        <w:pStyle w:val="FootnoteText"/>
+      </w:pPr>
+      <w:r>
+        <w:rPr>
+          <w:rStyle w:val="FootnoteReference"/>
+        </w:rPr>
+        <w:footnoteRef/>
+      </w:r>
+      <w:r>
+        <w:t xml:space="preserve"> </w:t>
+      </w:r>
+      <w:r>
+        <w:t xml:space="preserve">Klaus R. Scherer,</w:t>
+      </w:r>
+      <w:r>
+        <w:t xml:space="preserve"> </w:t>
+      </w:r>
+      <w:r>
+        <w:t xml:space="preserve">‘Appraisal Considered as a Process of Multilevel Sequential Checking’</w:t>
+      </w:r>
+      <w:r>
+        <w:t xml:space="preserve">, in Klaus R. Scherer, Angela Schorr and Tom Johnstone (eds),</w:t>
+      </w:r>
+      <w:r>
+        <w:t xml:space="preserve"> </w:t>
+      </w:r>
+      <w:r>
+        <w:rPr>
+          <w:i/>
+          <w:iCs/>
+        </w:rPr>
+        <w:t xml:space="preserve">Appraisal Processes in Emotion: Theory, Methods, Research</w:t>
+      </w:r>
+      <w:r>
+        <w:t xml:space="preserve"> </w:t>
+      </w:r>
+      <w:r>
+        <w:t xml:space="preserve">(New York: Oxford University Press, 2001), pp. 92-120; idem,</w:t>
+      </w:r>
+      <w:r>
+        <w:t xml:space="preserve"> </w:t>
+      </w:r>
+      <w:r>
+        <w:t xml:space="preserve">‘What Are Emotions? And How Can They Be Measured?’</w:t>
+      </w:r>
+      <w:r>
+        <w:t xml:space="preserve">,</w:t>
+      </w:r>
+      <w:r>
+        <w:t xml:space="preserve"> </w:t>
+      </w:r>
+      <w:r>
+        <w:rPr>
+          <w:i/>
+          <w:iCs/>
+        </w:rPr>
+        <w:t xml:space="preserve">Social Science Information</w:t>
+      </w:r>
+      <w:r>
+        <w:t xml:space="preserve"> </w:t>
+      </w:r>
+      <w:r>
+        <w:t xml:space="preserve">44:4 (2005), pp. 695-729.</w:t>
+      </w:r>
+    </w:p>
+  </w:footnote>
+  <w:footnote w:id="109">
+    <w:p>
+      <w:pPr>
+        <w:pStyle w:val="FootnoteText"/>
+      </w:pPr>
+      <w:r>
+        <w:rPr>
+          <w:rStyle w:val="FootnoteReference"/>
+        </w:rPr>
+        <w:footnoteRef/>
+      </w:r>
+      <w:r>
+        <w:t xml:space="preserve"> </w:t>
+      </w:r>
+      <w:r>
+        <w:t xml:space="preserve">Ira J. Roseman,</w:t>
+      </w:r>
+      <w:r>
+        <w:t xml:space="preserve"> </w:t>
+      </w:r>
+      <w:r>
+        <w:t xml:space="preserve">‘Appraisal Determinants of Emotions: Constructing a More Accurate and Comprehensive Theory’</w:t>
+      </w:r>
+      <w:r>
+        <w:t xml:space="preserve">,</w:t>
+      </w:r>
+      <w:r>
+        <w:t xml:space="preserve"> </w:t>
+      </w:r>
+      <w:r>
+        <w:rPr>
+          <w:i/>
+          <w:iCs/>
+        </w:rPr>
+        <w:t xml:space="preserve">Cognition and Emotion</w:t>
+      </w:r>
+      <w:r>
+        <w:t xml:space="preserve"> </w:t>
+      </w:r>
+      <w:r>
+        <w:t xml:space="preserve">10:3 (1996), pp. 241-277.</w:t>
+      </w:r>
+    </w:p>
+  </w:footnote>
+  <w:footnote w:id="110">
+    <w:p>
+      <w:pPr>
+        <w:pStyle w:val="FootnoteText"/>
+      </w:pPr>
+      <w:r>
+        <w:rPr>
+          <w:rStyle w:val="FootnoteReference"/>
+        </w:rPr>
+        <w:footnoteRef/>
+      </w:r>
+      <w:r>
+        <w:t xml:space="preserve"> </w:t>
+      </w:r>
+      <w:r>
         <w:t xml:space="preserve">Qarizadeh et al.,</w:t>
       </w:r>
       <w:r>
@@ -27375,183 +27459,6 @@
       </w:r>
       <w:r>
         <w:t xml:space="preserve">.</w:t>
-      </w:r>
-    </w:p>
-  </w:footnote>
-  <w:footnote w:id="119">
-    <w:p>
-      <w:pPr>
-        <w:pStyle w:val="FootnoteText"/>
-      </w:pPr>
-      <w:r>
-        <w:rPr>
-          <w:rStyle w:val="FootnoteReference"/>
-        </w:rPr>
-        <w:footnoteRef/>
-      </w:r>
-      <w:r>
-        <w:t xml:space="preserve"> </w:t>
-      </w:r>
-      <w:r>
-        <w:t xml:space="preserve">James J. Gross,</w:t>
-      </w:r>
-      <w:r>
-        <w:t xml:space="preserve"> </w:t>
-      </w:r>
-      <w:r>
-        <w:t xml:space="preserve">‘The Emerging Field of Emotion Regulation: An Integrative Review’</w:t>
-      </w:r>
-      <w:r>
-        <w:t xml:space="preserve">,</w:t>
-      </w:r>
-      <w:r>
-        <w:t xml:space="preserve"> </w:t>
-      </w:r>
-      <w:r>
-        <w:rPr>
-          <w:i/>
-          <w:iCs/>
-        </w:rPr>
-        <w:t xml:space="preserve">Review of General Psychology</w:t>
-      </w:r>
-      <w:r>
-        <w:t xml:space="preserve"> </w:t>
-      </w:r>
-      <w:r>
-        <w:t xml:space="preserve">2:3 (1998), pp. 271-299; idem (ed.),</w:t>
-      </w:r>
-      <w:r>
-        <w:t xml:space="preserve"> </w:t>
-      </w:r>
-      <w:r>
-        <w:rPr>
-          <w:i/>
-          <w:iCs/>
-        </w:rPr>
-        <w:t xml:space="preserve">Handbook of Emotion Regulation</w:t>
-      </w:r>
-      <w:r>
-        <w:t xml:space="preserve">, 2nd edn (New York: Guilford Press, 2014); idem,</w:t>
-      </w:r>
-      <w:r>
-        <w:t xml:space="preserve"> </w:t>
-      </w:r>
-      <w:r>
-        <w:t xml:space="preserve">‘Emotion Regulation: Current Status and Future Prospects’</w:t>
-      </w:r>
-      <w:r>
-        <w:t xml:space="preserve">,</w:t>
-      </w:r>
-      <w:r>
-        <w:t xml:space="preserve"> </w:t>
-      </w:r>
-      <w:r>
-        <w:rPr>
-          <w:i/>
-          <w:iCs/>
-        </w:rPr>
-        <w:t xml:space="preserve">Psychological Inquiry</w:t>
-      </w:r>
-      <w:r>
-        <w:t xml:space="preserve"> </w:t>
-      </w:r>
-      <w:r>
-        <w:t xml:space="preserve">26:1 (2015), pp. 1-26.</w:t>
-      </w:r>
-    </w:p>
-  </w:footnote>
-  <w:footnote w:id="120">
-    <w:p>
-      <w:pPr>
-        <w:pStyle w:val="FootnoteText"/>
-      </w:pPr>
-      <w:r>
-        <w:rPr>
-          <w:rStyle w:val="FootnoteReference"/>
-        </w:rPr>
-        <w:footnoteRef/>
-      </w:r>
-      <w:r>
-        <w:t xml:space="preserve"> </w:t>
-      </w:r>
-      <w:r>
-        <w:t xml:space="preserve">Robert Plutchik,</w:t>
-      </w:r>
-      <w:r>
-        <w:t xml:space="preserve"> </w:t>
-      </w:r>
-      <w:r>
-        <w:rPr>
-          <w:i/>
-          <w:iCs/>
-        </w:rPr>
-        <w:t xml:space="preserve">Emotion: A Psychoevolutionary Synthesis</w:t>
-      </w:r>
-      <w:r>
-        <w:t xml:space="preserve"> </w:t>
-      </w:r>
-      <w:r>
-        <w:t xml:space="preserve">(New York: Harper &amp; Row, 1980); idem,</w:t>
-      </w:r>
-      <w:r>
-        <w:t xml:space="preserve"> </w:t>
-      </w:r>
-      <w:r>
-        <w:t xml:space="preserve">‘The Nature of Emotions’</w:t>
-      </w:r>
-      <w:r>
-        <w:t xml:space="preserve">,</w:t>
-      </w:r>
-      <w:r>
-        <w:t xml:space="preserve"> </w:t>
-      </w:r>
-      <w:r>
-        <w:rPr>
-          <w:i/>
-          <w:iCs/>
-        </w:rPr>
-        <w:t xml:space="preserve">American Scientist</w:t>
-      </w:r>
-      <w:r>
-        <w:t xml:space="preserve"> </w:t>
-      </w:r>
-      <w:r>
-        <w:t xml:space="preserve">89:4 (2001), pp. 344-350.</w:t>
-      </w:r>
-    </w:p>
-  </w:footnote>
-  <w:footnote w:id="121">
-    <w:p>
-      <w:pPr>
-        <w:pStyle w:val="FootnoteText"/>
-      </w:pPr>
-      <w:r>
-        <w:rPr>
-          <w:rStyle w:val="FootnoteReference"/>
-        </w:rPr>
-        <w:footnoteRef/>
-      </w:r>
-      <w:r>
-        <w:t xml:space="preserve"> </w:t>
-      </w:r>
-      <w:r>
-        <w:t xml:space="preserve">Charles D. Spielberger,</w:t>
-      </w:r>
-      <w:r>
-        <w:t xml:space="preserve"> </w:t>
-      </w:r>
-      <w:r>
-        <w:rPr>
-          <w:i/>
-          <w:iCs/>
-        </w:rPr>
-        <w:t xml:space="preserve">Professional Manual for the State-Trait Anger Expression Inventory–2 (STAXI-2)</w:t>
-      </w:r>
-      <w:r>
-        <w:t xml:space="preserve"> </w:t>
-      </w:r>
-      <w:r>
-        <w:t xml:space="preserve">(Odessa, FL: Psychological Assessment Resources, 1999).</w:t>
       </w:r>
     </w:p>
   </w:footnote>
@@ -27570,60 +27477,70 @@
         <w:t xml:space="preserve"> </w:t>
       </w:r>
       <w:r>
-        <w:t xml:space="preserve">Nico H. Frijda,</w:t>
-      </w:r>
-      <w:r>
-        <w:t xml:space="preserve"> </w:t>
-      </w:r>
-      <w:r>
-        <w:rPr>
-          <w:i/>
-          <w:iCs/>
-        </w:rPr>
-        <w:t xml:space="preserve">The Emotions</w:t>
-      </w:r>
-      <w:r>
-        <w:t xml:space="preserve">, Studies in Emotion and Social Interaction (Cambridge: Cambridge University Press, 1986); Lazarus,</w:t>
-      </w:r>
-      <w:r>
-        <w:t xml:space="preserve"> </w:t>
-      </w:r>
-      <w:r>
-        <w:rPr>
-          <w:i/>
-          <w:iCs/>
-        </w:rPr>
-        <w:t xml:space="preserve">Emotion and Adaptation</w:t>
-      </w:r>
-      <w:r>
-        <w:t xml:space="preserve">; Roseman,</w:t>
-      </w:r>
-      <w:r>
-        <w:t xml:space="preserve"> </w:t>
-      </w:r>
-      <w:r>
-        <w:t xml:space="preserve">‘Appraisal Determinants’</w:t>
-      </w:r>
-      <w:r>
-        <w:t xml:space="preserve">; Scherer,</w:t>
-      </w:r>
-      <w:r>
-        <w:t xml:space="preserve"> </w:t>
-      </w:r>
-      <w:r>
-        <w:t xml:space="preserve">‘Appraisal Considered as a Process’</w:t>
-      </w:r>
-      <w:r>
-        <w:t xml:space="preserve">; idem,</w:t>
-      </w:r>
-      <w:r>
-        <w:t xml:space="preserve"> </w:t>
-      </w:r>
-      <w:r>
-        <w:t xml:space="preserve">‘What Are Emotions?’</w:t>
-      </w:r>
-      <w:r>
-        <w:t xml:space="preserve">.</w:t>
+        <w:t xml:space="preserve">James J. Gross,</w:t>
+      </w:r>
+      <w:r>
+        <w:t xml:space="preserve"> </w:t>
+      </w:r>
+      <w:r>
+        <w:t xml:space="preserve">‘The Emerging Field of Emotion Regulation: An Integrative Review’</w:t>
+      </w:r>
+      <w:r>
+        <w:t xml:space="preserve">,</w:t>
+      </w:r>
+      <w:r>
+        <w:t xml:space="preserve"> </w:t>
+      </w:r>
+      <w:r>
+        <w:rPr>
+          <w:i/>
+          <w:iCs/>
+        </w:rPr>
+        <w:t xml:space="preserve">Review of General Psychology</w:t>
+      </w:r>
+      <w:r>
+        <w:t xml:space="preserve"> </w:t>
+      </w:r>
+      <w:r>
+        <w:t xml:space="preserve">2:3 (1998), pp. 271-299; idem (ed.),</w:t>
+      </w:r>
+      <w:r>
+        <w:t xml:space="preserve"> </w:t>
+      </w:r>
+      <w:r>
+        <w:rPr>
+          <w:i/>
+          <w:iCs/>
+        </w:rPr>
+        <w:t xml:space="preserve">Handbook of Emotion Regulation</w:t>
+      </w:r>
+      <w:r>
+        <w:t xml:space="preserve">, 2nd edn (New York: Guilford Press, 2014); idem,</w:t>
+      </w:r>
+      <w:r>
+        <w:t xml:space="preserve"> </w:t>
+      </w:r>
+      <w:r>
+        <w:t xml:space="preserve">‘Emotion Regulation: Current Status and Future Prospects’</w:t>
+      </w:r>
+      <w:r>
+        <w:t xml:space="preserve">,</w:t>
+      </w:r>
+      <w:r>
+        <w:t xml:space="preserve"> </w:t>
+      </w:r>
+      <w:r>
+        <w:rPr>
+          <w:i/>
+          <w:iCs/>
+        </w:rPr>
+        <w:t xml:space="preserve">Psychological Inquiry</w:t>
+      </w:r>
+      <w:r>
+        <w:t xml:space="preserve"> </w:t>
+      </w:r>
+      <w:r>
+        <w:t xml:space="preserve">26:1 (2015), pp. 1-26.</w:t>
       </w:r>
     </w:p>
   </w:footnote>
@@ -27642,25 +27559,48 @@
         <w:t xml:space="preserve"> </w:t>
       </w:r>
       <w:r>
-        <w:t xml:space="preserve">Scherer,</w:t>
-      </w:r>
-      <w:r>
-        <w:t xml:space="preserve"> </w:t>
-      </w:r>
-      <w:r>
-        <w:t xml:space="preserve">‘Appraisal Considered as a Process’</w:t>
-      </w:r>
-      <w:r>
-        <w:t xml:space="preserve">, pp. 92-120; idem,</w:t>
-      </w:r>
-      <w:r>
-        <w:t xml:space="preserve"> </w:t>
-      </w:r>
-      <w:r>
-        <w:t xml:space="preserve">‘What Are Emotions?’</w:t>
-      </w:r>
-      <w:r>
-        <w:t xml:space="preserve">, pp. 695-729.</w:t>
+        <w:t xml:space="preserve">Robert Plutchik,</w:t>
+      </w:r>
+      <w:r>
+        <w:t xml:space="preserve"> </w:t>
+      </w:r>
+      <w:r>
+        <w:rPr>
+          <w:i/>
+          <w:iCs/>
+        </w:rPr>
+        <w:t xml:space="preserve">Emotion: A Psychoevolutionary Synthesis</w:t>
+      </w:r>
+      <w:r>
+        <w:t xml:space="preserve"> </w:t>
+      </w:r>
+      <w:r>
+        <w:t xml:space="preserve">(New York: Harper &amp; Row, 1980); idem,</w:t>
+      </w:r>
+      <w:r>
+        <w:t xml:space="preserve"> </w:t>
+      </w:r>
+      <w:r>
+        <w:t xml:space="preserve">‘The Nature of Emotions’</w:t>
+      </w:r>
+      <w:r>
+        <w:t xml:space="preserve">,</w:t>
+      </w:r>
+      <w:r>
+        <w:t xml:space="preserve"> </w:t>
+      </w:r>
+      <w:r>
+        <w:rPr>
+          <w:i/>
+          <w:iCs/>
+        </w:rPr>
+        <w:t xml:space="preserve">American Scientist</w:t>
+      </w:r>
+      <w:r>
+        <w:t xml:space="preserve"> </w:t>
+      </w:r>
+      <w:r>
+        <w:t xml:space="preserve">89:4 (2001), pp. 344-350.</w:t>
       </w:r>
     </w:p>
   </w:footnote>
@@ -27679,7 +27619,68 @@
         <w:t xml:space="preserve"> </w:t>
       </w:r>
       <w:r>
-        <w:t xml:space="preserve">Roseman,</w:t>
+        <w:t xml:space="preserve">Charles D. Spielberger,</w:t>
+      </w:r>
+      <w:r>
+        <w:t xml:space="preserve"> </w:t>
+      </w:r>
+      <w:r>
+        <w:rPr>
+          <w:i/>
+          <w:iCs/>
+        </w:rPr>
+        <w:t xml:space="preserve">Professional Manual for the State-Trait Anger Expression Inventory–2 (STAXI-2)</w:t>
+      </w:r>
+      <w:r>
+        <w:t xml:space="preserve"> </w:t>
+      </w:r>
+      <w:r>
+        <w:t xml:space="preserve">(Odessa, FL: Psychological Assessment Resources, 1999).</w:t>
+      </w:r>
+    </w:p>
+  </w:footnote>
+  <w:footnote w:id="125">
+    <w:p>
+      <w:pPr>
+        <w:pStyle w:val="FootnoteText"/>
+      </w:pPr>
+      <w:r>
+        <w:rPr>
+          <w:rStyle w:val="FootnoteReference"/>
+        </w:rPr>
+        <w:footnoteRef/>
+      </w:r>
+      <w:r>
+        <w:t xml:space="preserve"> </w:t>
+      </w:r>
+      <w:r>
+        <w:t xml:space="preserve">Nico H. Frijda,</w:t>
+      </w:r>
+      <w:r>
+        <w:t xml:space="preserve"> </w:t>
+      </w:r>
+      <w:r>
+        <w:rPr>
+          <w:i/>
+          <w:iCs/>
+        </w:rPr>
+        <w:t xml:space="preserve">The Emotions</w:t>
+      </w:r>
+      <w:r>
+        <w:t xml:space="preserve">, Studies in Emotion and Social Interaction (Cambridge: Cambridge University Press, 1986); Lazarus,</w:t>
+      </w:r>
+      <w:r>
+        <w:t xml:space="preserve"> </w:t>
+      </w:r>
+      <w:r>
+        <w:rPr>
+          <w:i/>
+          <w:iCs/>
+        </w:rPr>
+        <w:t xml:space="preserve">Emotion and Adaptation</w:t>
+      </w:r>
+      <w:r>
+        <w:t xml:space="preserve">; Roseman,</w:t>
       </w:r>
       <w:r>
         <w:t xml:space="preserve"> </w:t>
@@ -27688,7 +27689,62 @@
         <w:t xml:space="preserve">‘Appraisal Determinants’</w:t>
       </w:r>
       <w:r>
-        <w:t xml:space="preserve">, pp. 241-277.</w:t>
+        <w:t xml:space="preserve">; Scherer,</w:t>
+      </w:r>
+      <w:r>
+        <w:t xml:space="preserve"> </w:t>
+      </w:r>
+      <w:r>
+        <w:t xml:space="preserve">‘Appraisal Considered as a Process’</w:t>
+      </w:r>
+      <w:r>
+        <w:t xml:space="preserve">; idem,</w:t>
+      </w:r>
+      <w:r>
+        <w:t xml:space="preserve"> </w:t>
+      </w:r>
+      <w:r>
+        <w:t xml:space="preserve">‘What Are Emotions?’</w:t>
+      </w:r>
+      <w:r>
+        <w:t xml:space="preserve">.</w:t>
+      </w:r>
+    </w:p>
+  </w:footnote>
+  <w:footnote w:id="126">
+    <w:p>
+      <w:pPr>
+        <w:pStyle w:val="FootnoteText"/>
+      </w:pPr>
+      <w:r>
+        <w:rPr>
+          <w:rStyle w:val="FootnoteReference"/>
+        </w:rPr>
+        <w:footnoteRef/>
+      </w:r>
+      <w:r>
+        <w:t xml:space="preserve"> </w:t>
+      </w:r>
+      <w:r>
+        <w:t xml:space="preserve">Scherer,</w:t>
+      </w:r>
+      <w:r>
+        <w:t xml:space="preserve"> </w:t>
+      </w:r>
+      <w:r>
+        <w:t xml:space="preserve">‘Appraisal Considered as a Process’</w:t>
+      </w:r>
+      <w:r>
+        <w:t xml:space="preserve">, pp. 92-120; idem,</w:t>
+      </w:r>
+      <w:r>
+        <w:t xml:space="preserve"> </w:t>
+      </w:r>
+      <w:r>
+        <w:t xml:space="preserve">‘What Are Emotions?’</w:t>
+      </w:r>
+      <w:r>
+        <w:t xml:space="preserve">, pp. 695-729.</w:t>
       </w:r>
     </w:p>
   </w:footnote>
@@ -27707,121 +27763,16 @@
         <w:t xml:space="preserve"> </w:t>
       </w:r>
       <w:r>
-        <w:t xml:space="preserve">Salwa M. S. El-Awa,</w:t>
-      </w:r>
-      <w:r>
-        <w:t xml:space="preserve"> </w:t>
-      </w:r>
-      <w:r>
-        <w:rPr>
-          <w:i/>
-          <w:iCs/>
-        </w:rPr>
-        <w:t xml:space="preserve">Textual Relations in the Qurʾan: Relevance, Coherence and Structure</w:t>
-      </w:r>
-      <w:r>
-        <w:t xml:space="preserve">, Routledge Studies in the Qurʾan (London: Routledge, 2006).</w:t>
-      </w:r>
-    </w:p>
-  </w:footnote>
-  <w:footnote w:id="128">
-    <w:p>
-      <w:pPr>
-        <w:pStyle w:val="FootnoteText"/>
-      </w:pPr>
-      <w:r>
-        <w:rPr>
-          <w:rStyle w:val="FootnoteReference"/>
-        </w:rPr>
-        <w:footnoteRef/>
-      </w:r>
-      <w:r>
-        <w:t xml:space="preserve"> </w:t>
-      </w:r>
-      <w:r>
-        <w:t xml:space="preserve">Nicolai Sinai,</w:t>
-      </w:r>
-      <w:r>
-        <w:t xml:space="preserve"> </w:t>
-      </w:r>
-      <w:r>
-        <w:rPr>
-          <w:i/>
-          <w:iCs/>
-        </w:rPr>
-        <w:t xml:space="preserve">The Qurʾan: A Historical-Critical Introduction</w:t>
-      </w:r>
-      <w:r>
-        <w:t xml:space="preserve">, The New Edinburgh Islamic Surveys (Edinburgh: Edinburgh University Press, 2017); idem,</w:t>
-      </w:r>
-      <w:r>
-        <w:t xml:space="preserve"> </w:t>
-      </w:r>
-      <w:r>
-        <w:rPr>
-          <w:i/>
-          <w:iCs/>
-        </w:rPr>
-        <w:t xml:space="preserve">Key Terms of the Qurʾan: A Critical Dictionary</w:t>
-      </w:r>
-      <w:r>
-        <w:t xml:space="preserve"> </w:t>
-      </w:r>
-      <w:r>
-        <w:t xml:space="preserve">(Princeton: Princeton University Press, 2023).</w:t>
-      </w:r>
-    </w:p>
-  </w:footnote>
-  <w:footnote w:id="129">
-    <w:p>
-      <w:pPr>
-        <w:pStyle w:val="FootnoteText"/>
-      </w:pPr>
-      <w:r>
-        <w:rPr>
-          <w:rStyle w:val="FootnoteReference"/>
-        </w:rPr>
-        <w:footnoteRef/>
-      </w:r>
-      <w:r>
-        <w:t xml:space="preserve"> </w:t>
-      </w:r>
-      <w:r>
-        <w:t xml:space="preserve">Abdul-Baquee M. Sharaf and Eric Atwell,</w:t>
-      </w:r>
-      <w:r>
-        <w:t xml:space="preserve"> </w:t>
-      </w:r>
-      <w:r>
-        <w:t xml:space="preserve">‘QurAna: Corpus of the Quran Annotated with Pronominal Anaphora’</w:t>
-      </w:r>
-      <w:r>
-        <w:t xml:space="preserve">, in</w:t>
-      </w:r>
-      <w:r>
-        <w:t xml:space="preserve"> </w:t>
-      </w:r>
-      <w:r>
-        <w:rPr>
-          <w:i/>
-          <w:iCs/>
-        </w:rPr>
-        <w:t xml:space="preserve">Proceedings of the Eighth International Conference on Language Resources and Evaluation (LREC’12)</w:t>
-      </w:r>
-      <w:r>
-        <w:t xml:space="preserve"> </w:t>
-      </w:r>
-      <w:r>
-        <w:t xml:space="preserve">(Istanbul: ELRA, 2012), pp. 130-137; and idem,</w:t>
-      </w:r>
-      <w:r>
-        <w:t xml:space="preserve"> </w:t>
-      </w:r>
-      <w:r>
-        <w:t xml:space="preserve">‘QurSim: A Corpus for Evaluation of Relatedness in Short Texts’</w:t>
-      </w:r>
-      <w:r>
-        <w:t xml:space="preserve">, in the same volume, pp. 2295-2302.</w:t>
+        <w:t xml:space="preserve">Roseman,</w:t>
+      </w:r>
+      <w:r>
+        <w:t xml:space="preserve"> </w:t>
+      </w:r>
+      <w:r>
+        <w:t xml:space="preserve">‘Appraisal Determinants’</w:t>
+      </w:r>
+      <w:r>
+        <w:t xml:space="preserve">, pp. 241-277.</w:t>
       </w:r>
     </w:p>
   </w:footnote>
@@ -27840,20 +27791,20 @@
         <w:t xml:space="preserve"> </w:t>
       </w:r>
       <w:r>
-        <w:t xml:space="preserve">Diyam Akra, Tymaa Hammouda and Mustafa Jarrar,</w:t>
-      </w:r>
-      <w:r>
-        <w:t xml:space="preserve"> </w:t>
-      </w:r>
-      <w:r>
-        <w:rPr>
-          <w:i/>
-          <w:iCs/>
-        </w:rPr>
-        <w:t xml:space="preserve">QuranMorph: Morphologically Annotated Quranic Corpus</w:t>
-      </w:r>
-      <w:r>
-        <w:t xml:space="preserve">, arXiv preprint 2506.18148 (2025), https://arxiv.org/abs/2506.18148.</w:t>
+        <w:t xml:space="preserve">Salwa M. S. El-Awa,</w:t>
+      </w:r>
+      <w:r>
+        <w:t xml:space="preserve"> </w:t>
+      </w:r>
+      <w:r>
+        <w:rPr>
+          <w:i/>
+          <w:iCs/>
+        </w:rPr>
+        <w:t xml:space="preserve">Textual Relations in the Qurʾan: Relevance, Coherence and Structure</w:t>
+      </w:r>
+      <w:r>
+        <w:t xml:space="preserve">, Routledge Studies in the Qurʾan (London: Routledge, 2006).</w:t>
       </w:r>
     </w:p>
   </w:footnote>
@@ -27872,32 +27823,89 @@
         <w:t xml:space="preserve"> </w:t>
       </w:r>
       <w:r>
-        <w:t xml:space="preserve">Majdi Sawalha et al.,</w:t>
-      </w:r>
-      <w:r>
-        <w:t xml:space="preserve"> </w:t>
-      </w:r>
-      <w:r>
-        <w:t xml:space="preserve">‘Morphologically-Analyzed and Syntactically-Annotated Quran Dataset (MASAQ)’</w:t>
-      </w:r>
-      <w:r>
-        <w:t xml:space="preserve">,</w:t>
-      </w:r>
-      <w:r>
-        <w:t xml:space="preserve"> </w:t>
-      </w:r>
-      <w:r>
-        <w:rPr>
-          <w:i/>
-          <w:iCs/>
-        </w:rPr>
-        <w:t xml:space="preserve">Data in Brief</w:t>
-      </w:r>
-      <w:r>
-        <w:t xml:space="preserve"> </w:t>
-      </w:r>
-      <w:r>
-        <w:t xml:space="preserve">58 (2024), 111211, DOI: 10.1016/j.dib.2024.111211.</w:t>
+        <w:t xml:space="preserve">Nicolai Sinai,</w:t>
+      </w:r>
+      <w:r>
+        <w:t xml:space="preserve"> </w:t>
+      </w:r>
+      <w:r>
+        <w:rPr>
+          <w:i/>
+          <w:iCs/>
+        </w:rPr>
+        <w:t xml:space="preserve">The Qurʾan: A Historical-Critical Introduction</w:t>
+      </w:r>
+      <w:r>
+        <w:t xml:space="preserve">, The New Edinburgh Islamic Surveys (Edinburgh: Edinburgh University Press, 2017); idem,</w:t>
+      </w:r>
+      <w:r>
+        <w:t xml:space="preserve"> </w:t>
+      </w:r>
+      <w:r>
+        <w:rPr>
+          <w:i/>
+          <w:iCs/>
+        </w:rPr>
+        <w:t xml:space="preserve">Key Terms of the Qurʾan: A Critical Dictionary</w:t>
+      </w:r>
+      <w:r>
+        <w:t xml:space="preserve"> </w:t>
+      </w:r>
+      <w:r>
+        <w:t xml:space="preserve">(Princeton: Princeton University Press, 2023).</w:t>
+      </w:r>
+    </w:p>
+  </w:footnote>
+  <w:footnote w:id="132">
+    <w:p>
+      <w:pPr>
+        <w:pStyle w:val="FootnoteText"/>
+      </w:pPr>
+      <w:r>
+        <w:rPr>
+          <w:rStyle w:val="FootnoteReference"/>
+        </w:rPr>
+        <w:footnoteRef/>
+      </w:r>
+      <w:r>
+        <w:t xml:space="preserve"> </w:t>
+      </w:r>
+      <w:r>
+        <w:t xml:space="preserve">Abdul-Baquee M. Sharaf and Eric Atwell,</w:t>
+      </w:r>
+      <w:r>
+        <w:t xml:space="preserve"> </w:t>
+      </w:r>
+      <w:r>
+        <w:t xml:space="preserve">‘QurAna: Corpus of the Quran Annotated with Pronominal Anaphora’</w:t>
+      </w:r>
+      <w:r>
+        <w:t xml:space="preserve">, in</w:t>
+      </w:r>
+      <w:r>
+        <w:t xml:space="preserve"> </w:t>
+      </w:r>
+      <w:r>
+        <w:rPr>
+          <w:i/>
+          <w:iCs/>
+        </w:rPr>
+        <w:t xml:space="preserve">Proceedings of the Eighth International Conference on Language Resources and Evaluation (LREC’12)</w:t>
+      </w:r>
+      <w:r>
+        <w:t xml:space="preserve"> </w:t>
+      </w:r>
+      <w:r>
+        <w:t xml:space="preserve">(Istanbul: ELRA, 2012), pp. 130-137; and idem,</w:t>
+      </w:r>
+      <w:r>
+        <w:t xml:space="preserve"> </w:t>
+      </w:r>
+      <w:r>
+        <w:t xml:space="preserve">‘QurSim: A Corpus for Evaluation of Relatedness in Short Texts’</w:t>
+      </w:r>
+      <w:r>
+        <w:t xml:space="preserve">, in the same volume, pp. 2295-2302.</w:t>
       </w:r>
     </w:p>
   </w:footnote>
@@ -27916,16 +27924,20 @@
         <w:t xml:space="preserve"> </w:t>
       </w:r>
       <w:r>
-        <w:t xml:space="preserve">Lakoff and Kövecses,</w:t>
-      </w:r>
-      <w:r>
-        <w:t xml:space="preserve"> </w:t>
-      </w:r>
-      <w:r>
-        <w:t xml:space="preserve">‘Cognitive Model of Anger’</w:t>
-      </w:r>
-      <w:r>
-        <w:t xml:space="preserve">, pp. 195-221.</w:t>
+        <w:t xml:space="preserve">Diyam Akra, Tymaa Hammouda and Mustafa Jarrar,</w:t>
+      </w:r>
+      <w:r>
+        <w:t xml:space="preserve"> </w:t>
+      </w:r>
+      <w:r>
+        <w:rPr>
+          <w:i/>
+          <w:iCs/>
+        </w:rPr>
+        <w:t xml:space="preserve">QuranMorph: Morphologically Annotated Quranic Corpus</w:t>
+      </w:r>
+      <w:r>
+        <w:t xml:space="preserve">, arXiv preprint 2506.18148 (2025), https://arxiv.org/abs/2506.18148.</w:t>
       </w:r>
     </w:p>
   </w:footnote>
@@ -27944,42 +27956,13 @@
         <w:t xml:space="preserve"> </w:t>
       </w:r>
       <w:r>
-        <w:rPr>
-          <w:i/>
-          <w:iCs/>
-        </w:rPr>
-        <w:t xml:space="preserve">Chicago Assyrian Dictionary</w:t>
-      </w:r>
-      <w:r>
-        <w:t xml:space="preserve">, vol. L (Chicago: Oriental Institute, 1973), p. 164; D. Bodi,</w:t>
-      </w:r>
-      <w:r>
-        <w:t xml:space="preserve"> </w:t>
-      </w:r>
-      <w:r>
-        <w:t xml:space="preserve">‘An Akkadian-Aramaic Idiomatic Expression in Ezekiel 16:30</w:t>
-      </w:r>
-      <w:r>
-        <w:t xml:space="preserve"> </w:t>
-      </w:r>
-      <w:r>
-        <w:rPr>
-          <w:i/>
-          <w:iCs/>
-        </w:rPr>
-        <w:t xml:space="preserve">amūlâ libbātēk</w:t>
-      </w:r>
-      <w:r>
-        <w:t xml:space="preserve"> </w:t>
-      </w:r>
-      <w:r>
-        <w:t xml:space="preserve">“I am filled with anger against you,”</w:t>
-      </w:r>
-      <w:r>
-        <w:t xml:space="preserve"> </w:t>
-      </w:r>
-      <w:r>
-        <w:t xml:space="preserve">and Remarks on the Languages in Persian Times’</w:t>
+        <w:t xml:space="preserve">Majdi Sawalha et al.,</w:t>
+      </w:r>
+      <w:r>
+        <w:t xml:space="preserve"> </w:t>
+      </w:r>
+      <w:r>
+        <w:t xml:space="preserve">‘Morphologically-Analyzed and Syntactically-Annotated Quran Dataset (MASAQ)’</w:t>
       </w:r>
       <w:r>
         <w:t xml:space="preserve">,</w:t>
@@ -27992,57 +27975,13 @@
           <w:i/>
           <w:iCs/>
         </w:rPr>
-        <w:t xml:space="preserve">Transeuphratène</w:t>
-      </w:r>
-      <w:r>
-        <w:t xml:space="preserve"> </w:t>
-      </w:r>
-      <w:r>
-        <w:t xml:space="preserve">50 (2018), pp. 13-38.</w:t>
-      </w:r>
-    </w:p>
-  </w:footnote>
-  <w:footnote w:id="135">
-    <w:p>
-      <w:pPr>
-        <w:pStyle w:val="FootnoteText"/>
-      </w:pPr>
-      <w:r>
-        <w:rPr>
-          <w:rStyle w:val="FootnoteReference"/>
-        </w:rPr>
-        <w:footnoteRef/>
-      </w:r>
-      <w:r>
-        <w:t xml:space="preserve"> </w:t>
-      </w:r>
-      <w:r>
-        <w:t xml:space="preserve">J. Lauri, S. Svärd, T. Alstola, H. Jauhiainen, A. Sahala, K. Lindén, M. Sams and L. Nummenmaa,</w:t>
-      </w:r>
-      <w:r>
-        <w:t xml:space="preserve"> </w:t>
-      </w:r>
-      <w:r>
-        <w:t xml:space="preserve">‘Embodied Emotions in Ancient Neo-Assyrian Texts Revealed by Bodily Mapping of Emotional Semantics’</w:t>
-      </w:r>
-      <w:r>
-        <w:t xml:space="preserve">,</w:t>
-      </w:r>
-      <w:r>
-        <w:t xml:space="preserve"> </w:t>
-      </w:r>
-      <w:r>
-        <w:rPr>
-          <w:i/>
-          <w:iCs/>
-        </w:rPr>
-        <w:t xml:space="preserve">iScience</w:t>
-      </w:r>
-      <w:r>
-        <w:t xml:space="preserve"> </w:t>
-      </w:r>
-      <w:r>
-        <w:t xml:space="preserve">27:12 (2024), 111365, DOI: 10.1016/j.isci.2024.111365.</w:t>
+        <w:t xml:space="preserve">Data in Brief</w:t>
+      </w:r>
+      <w:r>
+        <w:t xml:space="preserve"> </w:t>
+      </w:r>
+      <w:r>
+        <w:t xml:space="preserve">58 (2024), 111211, DOI: 10.1016/j.dib.2024.111211.</w:t>
       </w:r>
     </w:p>
   </w:footnote>
@@ -28061,57 +28000,16 @@
         <w:t xml:space="preserve"> </w:t>
       </w:r>
       <w:r>
-        <w:t xml:space="preserve">P. A. Kruger,</w:t>
-      </w:r>
-      <w:r>
-        <w:t xml:space="preserve"> </w:t>
-      </w:r>
-      <w:r>
-        <w:t xml:space="preserve">‘A Cognitive Interpretation of the Emotion of Anger in the Hebrew Bible’</w:t>
-      </w:r>
-      <w:r>
-        <w:t xml:space="preserve">,</w:t>
-      </w:r>
-      <w:r>
-        <w:t xml:space="preserve"> </w:t>
-      </w:r>
-      <w:r>
-        <w:rPr>
-          <w:i/>
-          <w:iCs/>
-        </w:rPr>
-        <w:t xml:space="preserve">Journal of Northwest Semitic Languages</w:t>
-      </w:r>
-      <w:r>
-        <w:t xml:space="preserve"> </w:t>
-      </w:r>
-      <w:r>
-        <w:t xml:space="preserve">26:1 (2000), pp. 181-193; idem,</w:t>
-      </w:r>
-      <w:r>
-        <w:t xml:space="preserve"> </w:t>
-      </w:r>
-      <w:r>
-        <w:t xml:space="preserve">‘Emotions in the Hebrew Bible: A Few Observations on Prospects and Challenges’</w:t>
-      </w:r>
-      <w:r>
-        <w:t xml:space="preserve">,</w:t>
-      </w:r>
-      <w:r>
-        <w:t xml:space="preserve"> </w:t>
-      </w:r>
-      <w:r>
-        <w:rPr>
-          <w:i/>
-          <w:iCs/>
-        </w:rPr>
-        <w:t xml:space="preserve">Old Testament Essays</w:t>
-      </w:r>
-      <w:r>
-        <w:t xml:space="preserve"> </w:t>
-      </w:r>
-      <w:r>
-        <w:t xml:space="preserve">28:2 (2015), pp. 395-420.</w:t>
+        <w:t xml:space="preserve">Lakoff and Kövecses,</w:t>
+      </w:r>
+      <w:r>
+        <w:t xml:space="preserve"> </w:t>
+      </w:r>
+      <w:r>
+        <w:t xml:space="preserve">‘Cognitive Model of Anger’</w:t>
+      </w:r>
+      <w:r>
+        <w:t xml:space="preserve">, pp. 195-221.</w:t>
       </w:r>
     </w:p>
   </w:footnote>
@@ -28130,23 +28028,61 @@
         <w:t xml:space="preserve"> </w:t>
       </w:r>
       <w:r>
-        <w:t xml:space="preserve">Leonard C. Muellner,</w:t>
-      </w:r>
-      <w:r>
-        <w:t xml:space="preserve"> </w:t>
-      </w:r>
-      <w:r>
-        <w:rPr>
-          <w:i/>
-          <w:iCs/>
-        </w:rPr>
-        <w:t xml:space="preserve">The Anger of Achilles: Mēnis in Greek Epic</w:t>
-      </w:r>
-      <w:r>
-        <w:t xml:space="preserve"> </w:t>
-      </w:r>
-      <w:r>
-        <w:t xml:space="preserve">(Ithaca, NY: Cornell University Press, 1996).</w:t>
+        <w:rPr>
+          <w:i/>
+          <w:iCs/>
+        </w:rPr>
+        <w:t xml:space="preserve">Chicago Assyrian Dictionary</w:t>
+      </w:r>
+      <w:r>
+        <w:t xml:space="preserve">, vol. L (Chicago: Oriental Institute, 1973), p. 164; D. Bodi,</w:t>
+      </w:r>
+      <w:r>
+        <w:t xml:space="preserve"> </w:t>
+      </w:r>
+      <w:r>
+        <w:t xml:space="preserve">‘An Akkadian-Aramaic Idiomatic Expression in Ezekiel 16:30</w:t>
+      </w:r>
+      <w:r>
+        <w:t xml:space="preserve"> </w:t>
+      </w:r>
+      <w:r>
+        <w:rPr>
+          <w:i/>
+          <w:iCs/>
+        </w:rPr>
+        <w:t xml:space="preserve">amūlâ libbātēk</w:t>
+      </w:r>
+      <w:r>
+        <w:t xml:space="preserve"> </w:t>
+      </w:r>
+      <w:r>
+        <w:t xml:space="preserve">“I am filled with anger against you,”</w:t>
+      </w:r>
+      <w:r>
+        <w:t xml:space="preserve"> </w:t>
+      </w:r>
+      <w:r>
+        <w:t xml:space="preserve">and Remarks on the Languages in Persian Times’</w:t>
+      </w:r>
+      <w:r>
+        <w:t xml:space="preserve">,</w:t>
+      </w:r>
+      <w:r>
+        <w:t xml:space="preserve"> </w:t>
+      </w:r>
+      <w:r>
+        <w:rPr>
+          <w:i/>
+          <w:iCs/>
+        </w:rPr>
+        <w:t xml:space="preserve">Transeuphratène</w:t>
+      </w:r>
+      <w:r>
+        <w:t xml:space="preserve"> </w:t>
+      </w:r>
+      <w:r>
+        <w:t xml:space="preserve">50 (2018), pp. 13-38.</w:t>
       </w:r>
     </w:p>
   </w:footnote>
@@ -28165,29 +28101,32 @@
         <w:t xml:space="preserve"> </w:t>
       </w:r>
       <w:r>
-        <w:t xml:space="preserve">Douglas L. Cairns,</w:t>
-      </w:r>
-      <w:r>
-        <w:t xml:space="preserve"> </w:t>
-      </w:r>
-      <w:r>
-        <w:t xml:space="preserve">‘Ethics, Ethology, Terminology: Iliadic Anger and the Cross-cultural Study of Emotion’</w:t>
-      </w:r>
-      <w:r>
-        <w:t xml:space="preserve">, in S. Braund and G. W. Most (eds),</w:t>
-      </w:r>
-      <w:r>
-        <w:t xml:space="preserve"> </w:t>
-      </w:r>
-      <w:r>
-        <w:rPr>
-          <w:i/>
-          <w:iCs/>
-        </w:rPr>
-        <w:t xml:space="preserve">Ancient Anger: Perspectives from Homer to Galen</w:t>
-      </w:r>
-      <w:r>
-        <w:t xml:space="preserve">, Yale Classical Studies 32 (Cambridge: Cambridge University Press, 2003), pp. 11-49.</w:t>
+        <w:t xml:space="preserve">J. Lauri, S. Svärd, T. Alstola, H. Jauhiainen, A. Sahala, K. Lindén, M. Sams and L. Nummenmaa,</w:t>
+      </w:r>
+      <w:r>
+        <w:t xml:space="preserve"> </w:t>
+      </w:r>
+      <w:r>
+        <w:t xml:space="preserve">‘Embodied Emotions in Ancient Neo-Assyrian Texts Revealed by Bodily Mapping of Emotional Semantics’</w:t>
+      </w:r>
+      <w:r>
+        <w:t xml:space="preserve">,</w:t>
+      </w:r>
+      <w:r>
+        <w:t xml:space="preserve"> </w:t>
+      </w:r>
+      <w:r>
+        <w:rPr>
+          <w:i/>
+          <w:iCs/>
+        </w:rPr>
+        <w:t xml:space="preserve">iScience</w:t>
+      </w:r>
+      <w:r>
+        <w:t xml:space="preserve"> </w:t>
+      </w:r>
+      <w:r>
+        <w:t xml:space="preserve">27:12 (2024), 111365, DOI: 10.1016/j.isci.2024.111365.</w:t>
       </w:r>
     </w:p>
   </w:footnote>
@@ -28206,33 +28145,57 @@
         <w:t xml:space="preserve"> </w:t>
       </w:r>
       <w:r>
-        <w:t xml:space="preserve">Stephanie W. Jamison and Joel P. Brereton,</w:t>
-      </w:r>
-      <w:r>
-        <w:t xml:space="preserve"> </w:t>
-      </w:r>
-      <w:r>
-        <w:rPr>
-          <w:i/>
-          <w:iCs/>
-        </w:rPr>
-        <w:t xml:space="preserve">The Rigveda: The Earliest Religious Poetry of India</w:t>
-      </w:r>
-      <w:r>
-        <w:t xml:space="preserve">, 3 vols. (New York: Oxford University Press, 2014), vol. III for translation of and commentary on the</w:t>
-      </w:r>
-      <w:r>
-        <w:t xml:space="preserve"> </w:t>
-      </w:r>
-      <w:r>
-        <w:rPr>
-          <w:i/>
-          <w:iCs/>
-        </w:rPr>
-        <w:t xml:space="preserve">Manyu-Sūkta</w:t>
-      </w:r>
-      <w:r>
-        <w:t xml:space="preserve">, ṚV 10.83-84.</w:t>
+        <w:t xml:space="preserve">P. A. Kruger,</w:t>
+      </w:r>
+      <w:r>
+        <w:t xml:space="preserve"> </w:t>
+      </w:r>
+      <w:r>
+        <w:t xml:space="preserve">‘A Cognitive Interpretation of the Emotion of Anger in the Hebrew Bible’</w:t>
+      </w:r>
+      <w:r>
+        <w:t xml:space="preserve">,</w:t>
+      </w:r>
+      <w:r>
+        <w:t xml:space="preserve"> </w:t>
+      </w:r>
+      <w:r>
+        <w:rPr>
+          <w:i/>
+          <w:iCs/>
+        </w:rPr>
+        <w:t xml:space="preserve">Journal of Northwest Semitic Languages</w:t>
+      </w:r>
+      <w:r>
+        <w:t xml:space="preserve"> </w:t>
+      </w:r>
+      <w:r>
+        <w:t xml:space="preserve">26:1 (2000), pp. 181-193; idem,</w:t>
+      </w:r>
+      <w:r>
+        <w:t xml:space="preserve"> </w:t>
+      </w:r>
+      <w:r>
+        <w:t xml:space="preserve">‘Emotions in the Hebrew Bible: A Few Observations on Prospects and Challenges’</w:t>
+      </w:r>
+      <w:r>
+        <w:t xml:space="preserve">,</w:t>
+      </w:r>
+      <w:r>
+        <w:t xml:space="preserve"> </w:t>
+      </w:r>
+      <w:r>
+        <w:rPr>
+          <w:i/>
+          <w:iCs/>
+        </w:rPr>
+        <w:t xml:space="preserve">Old Testament Essays</w:t>
+      </w:r>
+      <w:r>
+        <w:t xml:space="preserve"> </w:t>
+      </w:r>
+      <w:r>
+        <w:t xml:space="preserve">28:2 (2015), pp. 395-420.</w:t>
       </w:r>
     </w:p>
   </w:footnote>
@@ -28251,32 +28214,23 @@
         <w:t xml:space="preserve"> </w:t>
       </w:r>
       <w:r>
-        <w:t xml:space="preserve">Ning Yu,</w:t>
-      </w:r>
-      <w:r>
-        <w:t xml:space="preserve"> </w:t>
-      </w:r>
-      <w:r>
-        <w:t xml:space="preserve">‘Metaphorical Expressions of Anger and Happiness in English and Chinese’</w:t>
-      </w:r>
-      <w:r>
-        <w:t xml:space="preserve">,</w:t>
-      </w:r>
-      <w:r>
-        <w:t xml:space="preserve"> </w:t>
-      </w:r>
-      <w:r>
-        <w:rPr>
-          <w:i/>
-          <w:iCs/>
-        </w:rPr>
-        <w:t xml:space="preserve">Metaphor and Symbolic Activity</w:t>
-      </w:r>
-      <w:r>
-        <w:t xml:space="preserve"> </w:t>
-      </w:r>
-      <w:r>
-        <w:t xml:space="preserve">10:2 (1995), pp. 59-92, DOI: 10.1207/s15327868ms1002_1.</w:t>
+        <w:t xml:space="preserve">Leonard C. Muellner,</w:t>
+      </w:r>
+      <w:r>
+        <w:t xml:space="preserve"> </w:t>
+      </w:r>
+      <w:r>
+        <w:rPr>
+          <w:i/>
+          <w:iCs/>
+        </w:rPr>
+        <w:t xml:space="preserve">The Anger of Achilles: Mēnis in Greek Epic</w:t>
+      </w:r>
+      <w:r>
+        <w:t xml:space="preserve"> </w:t>
+      </w:r>
+      <w:r>
+        <w:t xml:space="preserve">(Ithaca, NY: Cornell University Press, 1996).</w:t>
       </w:r>
     </w:p>
   </w:footnote>
@@ -28295,20 +28249,29 @@
         <w:t xml:space="preserve"> </w:t>
       </w:r>
       <w:r>
-        <w:t xml:space="preserve">Kövecses, Benczes and Szelid (eds),</w:t>
-      </w:r>
-      <w:r>
-        <w:t xml:space="preserve"> </w:t>
-      </w:r>
-      <w:r>
-        <w:rPr>
-          <w:i/>
-          <w:iCs/>
-        </w:rPr>
-        <w:t xml:space="preserve">Metaphors of ANGER</w:t>
-      </w:r>
-      <w:r>
-        <w:t xml:space="preserve">.</w:t>
+        <w:t xml:space="preserve">Douglas L. Cairns,</w:t>
+      </w:r>
+      <w:r>
+        <w:t xml:space="preserve"> </w:t>
+      </w:r>
+      <w:r>
+        <w:t xml:space="preserve">‘Ethics, Ethology, Terminology: Iliadic Anger and the Cross-cultural Study of Emotion’</w:t>
+      </w:r>
+      <w:r>
+        <w:t xml:space="preserve">, in S. Braund and G. W. Most (eds),</w:t>
+      </w:r>
+      <w:r>
+        <w:t xml:space="preserve"> </w:t>
+      </w:r>
+      <w:r>
+        <w:rPr>
+          <w:i/>
+          <w:iCs/>
+        </w:rPr>
+        <w:t xml:space="preserve">Ancient Anger: Perspectives from Homer to Galen</w:t>
+      </w:r>
+      <w:r>
+        <w:t xml:space="preserve">, Yale Classical Studies 32 (Cambridge: Cambridge University Press, 2003), pp. 11-49.</w:t>
       </w:r>
     </w:p>
   </w:footnote>
@@ -28327,20 +28290,33 @@
         <w:t xml:space="preserve"> </w:t>
       </w:r>
       <w:r>
-        <w:t xml:space="preserve">Kövecses, Benczes and Szelid (eds),</w:t>
-      </w:r>
-      <w:r>
-        <w:t xml:space="preserve"> </w:t>
-      </w:r>
-      <w:r>
-        <w:rPr>
-          <w:i/>
-          <w:iCs/>
-        </w:rPr>
-        <w:t xml:space="preserve">Metaphors of ANGER</w:t>
-      </w:r>
-      <w:r>
-        <w:t xml:space="preserve">.</w:t>
+        <w:t xml:space="preserve">Stephanie W. Jamison and Joel P. Brereton,</w:t>
+      </w:r>
+      <w:r>
+        <w:t xml:space="preserve"> </w:t>
+      </w:r>
+      <w:r>
+        <w:rPr>
+          <w:i/>
+          <w:iCs/>
+        </w:rPr>
+        <w:t xml:space="preserve">The Rigveda: The Earliest Religious Poetry of India</w:t>
+      </w:r>
+      <w:r>
+        <w:t xml:space="preserve">, 3 vols. (New York: Oxford University Press, 2014), vol. III for translation of and commentary on the</w:t>
+      </w:r>
+      <w:r>
+        <w:t xml:space="preserve"> </w:t>
+      </w:r>
+      <w:r>
+        <w:rPr>
+          <w:i/>
+          <w:iCs/>
+        </w:rPr>
+        <w:t xml:space="preserve">Manyu-Sūkta</w:t>
+      </w:r>
+      <w:r>
+        <w:t xml:space="preserve">, ṚV 10.83-84.</w:t>
       </w:r>
     </w:p>
   </w:footnote>
@@ -28359,6 +28335,114 @@
         <w:t xml:space="preserve"> </w:t>
       </w:r>
       <w:r>
+        <w:t xml:space="preserve">Ning Yu,</w:t>
+      </w:r>
+      <w:r>
+        <w:t xml:space="preserve"> </w:t>
+      </w:r>
+      <w:r>
+        <w:t xml:space="preserve">‘Metaphorical Expressions of Anger and Happiness in English and Chinese’</w:t>
+      </w:r>
+      <w:r>
+        <w:t xml:space="preserve">,</w:t>
+      </w:r>
+      <w:r>
+        <w:t xml:space="preserve"> </w:t>
+      </w:r>
+      <w:r>
+        <w:rPr>
+          <w:i/>
+          <w:iCs/>
+        </w:rPr>
+        <w:t xml:space="preserve">Metaphor and Symbolic Activity</w:t>
+      </w:r>
+      <w:r>
+        <w:t xml:space="preserve"> </w:t>
+      </w:r>
+      <w:r>
+        <w:t xml:space="preserve">10:2 (1995), pp. 59-92, DOI: 10.1207/s15327868ms1002_1.</w:t>
+      </w:r>
+    </w:p>
+  </w:footnote>
+  <w:footnote w:id="144">
+    <w:p>
+      <w:pPr>
+        <w:pStyle w:val="FootnoteText"/>
+      </w:pPr>
+      <w:r>
+        <w:rPr>
+          <w:rStyle w:val="FootnoteReference"/>
+        </w:rPr>
+        <w:footnoteRef/>
+      </w:r>
+      <w:r>
+        <w:t xml:space="preserve"> </w:t>
+      </w:r>
+      <w:r>
+        <w:t xml:space="preserve">Kövecses, Benczes and Szelid (eds),</w:t>
+      </w:r>
+      <w:r>
+        <w:t xml:space="preserve"> </w:t>
+      </w:r>
+      <w:r>
+        <w:rPr>
+          <w:i/>
+          <w:iCs/>
+        </w:rPr>
+        <w:t xml:space="preserve">Metaphors of ANGER</w:t>
+      </w:r>
+      <w:r>
+        <w:t xml:space="preserve">.</w:t>
+      </w:r>
+    </w:p>
+  </w:footnote>
+  <w:footnote w:id="145">
+    <w:p>
+      <w:pPr>
+        <w:pStyle w:val="FootnoteText"/>
+      </w:pPr>
+      <w:r>
+        <w:rPr>
+          <w:rStyle w:val="FootnoteReference"/>
+        </w:rPr>
+        <w:footnoteRef/>
+      </w:r>
+      <w:r>
+        <w:t xml:space="preserve"> </w:t>
+      </w:r>
+      <w:r>
+        <w:t xml:space="preserve">Kövecses, Benczes and Szelid (eds),</w:t>
+      </w:r>
+      <w:r>
+        <w:t xml:space="preserve"> </w:t>
+      </w:r>
+      <w:r>
+        <w:rPr>
+          <w:i/>
+          <w:iCs/>
+        </w:rPr>
+        <w:t xml:space="preserve">Metaphors of ANGER</w:t>
+      </w:r>
+      <w:r>
+        <w:t xml:space="preserve">.</w:t>
+      </w:r>
+    </w:p>
+  </w:footnote>
+  <w:footnote w:id="146">
+    <w:p>
+      <w:pPr>
+        <w:pStyle w:val="FootnoteText"/>
+      </w:pPr>
+      <w:r>
+        <w:rPr>
+          <w:rStyle w:val="FootnoteReference"/>
+        </w:rPr>
+        <w:footnoteRef/>
+      </w:r>
+      <w:r>
+        <w:t xml:space="preserve"> </w:t>
+      </w:r>
+      <w:r>
         <w:t xml:space="preserve">Lakoff and Kövecses,</w:t>
       </w:r>
       <w:r>
@@ -28385,7 +28469,7 @@
       </w:r>
     </w:p>
   </w:footnote>
-  <w:footnote w:id="148">
+  <w:footnote w:id="151">
     <w:p>
       <w:pPr>
         <w:pStyle w:val="FootnoteText"/>
@@ -28413,7 +28497,7 @@
       </w:r>
     </w:p>
   </w:footnote>
-  <w:footnote w:id="149">
+  <w:footnote w:id="152">
     <w:p>
       <w:pPr>
         <w:pStyle w:val="FootnoteText"/>
@@ -28441,7 +28525,7 @@
       </w:r>
     </w:p>
   </w:footnote>
-  <w:footnote w:id="153">
+  <w:footnote w:id="156">
     <w:p>
       <w:pPr>
         <w:pStyle w:val="FootnoteText"/>
@@ -28480,38 +28564,6 @@
           <w:iCs/>
         </w:rPr>
         <w:t xml:space="preserve">Istiʿārah-hā-yi Mafhūmī</w:t>
-      </w:r>
-      <w:r>
-        <w:t xml:space="preserve">.</w:t>
-      </w:r>
-    </w:p>
-  </w:footnote>
-  <w:footnote w:id="154">
-    <w:p>
-      <w:pPr>
-        <w:pStyle w:val="FootnoteText"/>
-      </w:pPr>
-      <w:r>
-        <w:rPr>
-          <w:rStyle w:val="FootnoteReference"/>
-        </w:rPr>
-        <w:footnoteRef/>
-      </w:r>
-      <w:r>
-        <w:t xml:space="preserve"> </w:t>
-      </w:r>
-      <w:r>
-        <w:t xml:space="preserve">Pakatchi and Afrashi,</w:t>
-      </w:r>
-      <w:r>
-        <w:t xml:space="preserve"> </w:t>
-      </w:r>
-      <w:r>
-        <w:rPr>
-          <w:i/>
-          <w:iCs/>
-        </w:rPr>
-        <w:t xml:space="preserve">Rūykardhā-yi Maʿnā-shinākhtī</w:t>
       </w:r>
       <w:r>
         <w:t xml:space="preserve">.</w:t>
@@ -28533,6 +28585,38 @@
         <w:t xml:space="preserve"> </w:t>
       </w:r>
       <w:r>
+        <w:t xml:space="preserve">Pakatchi and Afrashi,</w:t>
+      </w:r>
+      <w:r>
+        <w:t xml:space="preserve"> </w:t>
+      </w:r>
+      <w:r>
+        <w:rPr>
+          <w:i/>
+          <w:iCs/>
+        </w:rPr>
+        <w:t xml:space="preserve">Rūykardhā-yi Maʿnā-shinākhtī</w:t>
+      </w:r>
+      <w:r>
+        <w:t xml:space="preserve">.</w:t>
+      </w:r>
+    </w:p>
+  </w:footnote>
+  <w:footnote w:id="160">
+    <w:p>
+      <w:pPr>
+        <w:pStyle w:val="FootnoteText"/>
+      </w:pPr>
+      <w:r>
+        <w:rPr>
+          <w:rStyle w:val="FootnoteReference"/>
+        </w:rPr>
+        <w:footnoteRef/>
+      </w:r>
+      <w:r>
+        <w:t xml:space="preserve"> </w:t>
+      </w:r>
+      <w:r>
         <w:t xml:space="preserve">El-Awa,</w:t>
       </w:r>
       <w:r>
@@ -28550,7 +28634,7 @@
       </w:r>
     </w:p>
   </w:footnote>
-  <w:footnote w:id="158">
+  <w:footnote w:id="161">
     <w:p>
       <w:pPr>
         <w:pStyle w:val="FootnoteText"/>
@@ -28595,7 +28679,7 @@
       </w:r>
     </w:p>
   </w:footnote>
-  <w:footnote w:id="169">
+  <w:footnote w:id="172">
     <w:p>
       <w:pPr>
         <w:pStyle w:val="FootnoteText"/>

</xml_diff>